<commit_message>
Catalog panel shows the ENTIRE text (Adam's report)
The evidence panel was cut at 1,200 bytes. It now renders the
complete text of any text file. Guards, because an intake folder
also holds scans, PDFs, and OCR models: a binary file (NUL sniff in
the first 4 KB) gets an honest "no preview" note instead of a
garbage dump, and a text file beyond 20 MB — far past the largest
real ACIP text (2.6 MB in the installed library) — is capped with
the cap stated and the Overlay offered for the rest.

Selftest +2 pins: a file whose distinctive END lies past the old
cap must reach the panel whole; a binary file must draw the note,
not the dump. Manual 14.3 updated; both copies + docx.

Co-Authored-By: Claude Opus 5 (1M context) <noreply@anthropic.com>
</commit_message>
<xml_diff>
--- a/docs/distribution/USER_MANUAL.docx
+++ b/docs/distribution/USER_MANUAL.docx
@@ -30286,7 +30286,59 @@
         <w:t xml:space="preserve"> </w:t>
       </w:r>
       <w:r>
-        <w:t xml:space="preserve">text itself, and the file’s opening lines below.</w:t>
+        <w:t xml:space="preserve">text in the reading pane, and the file’s</w:t>
+      </w:r>
+      <w:r>
+        <w:t xml:space="preserve"> </w:t>
+      </w:r>
+      <w:r>
+        <w:rPr>
+          <w:b/>
+          <w:bCs/>
+        </w:rPr>
+        <w:t xml:space="preserve">complete text</w:t>
+      </w:r>
+      <w:r>
+        <w:t xml:space="preserve"> </w:t>
+      </w:r>
+      <w:r>
+        <w:t xml:space="preserve">below —</w:t>
+      </w:r>
+      <w:r>
+        <w:t xml:space="preserve"> </w:t>
+      </w:r>
+      <w:r>
+        <w:t xml:space="preserve">the panel never truncates a text file. (A binary file — a scan, a</w:t>
+      </w:r>
+      <w:r>
+        <w:t xml:space="preserve"> </w:t>
+      </w:r>
+      <w:r>
+        <w:t xml:space="preserve">PDF — gets an honest</w:t>
+      </w:r>
+      <w:r>
+        <w:t xml:space="preserve"> </w:t>
+      </w:r>
+      <w:r>
+        <w:t xml:space="preserve">“no preview”</w:t>
+      </w:r>
+      <w:r>
+        <w:t xml:space="preserve"> </w:t>
+      </w:r>
+      <w:r>
+        <w:t xml:space="preserve">note instead of a garbage dump,</w:t>
+      </w:r>
+      <w:r>
+        <w:t xml:space="preserve"> </w:t>
+      </w:r>
+      <w:r>
+        <w:t xml:space="preserve">and a text file beyond 20 MB, far past any real ACIP text, is</w:t>
+      </w:r>
+      <w:r>
+        <w:t xml:space="preserve"> </w:t>
+      </w:r>
+      <w:r>
+        <w:t xml:space="preserve">capped with the cap stated.)</w:t>
       </w:r>
     </w:p>
     <w:bookmarkEnd w:id="119"/>

</xml_diff>

<commit_message>
Loop 18 docs: witness-hunt manual section + queue checkoff (the doc script had died on a quoting bug; code shipped in f3d9ed5)
Co-Authored-By: Claude Opus 5 (1M context) <noreply@anthropic.com>
</commit_message>
<xml_diff>
--- a/docs/distribution/USER_MANUAL.docx
+++ b/docs/distribution/USER_MANUAL.docx
@@ -31111,6 +31111,116 @@
       </w:r>
       <w:r>
         <w:t xml:space="preserve">witness, input, propose, approve.</w:t>
+      </w:r>
+    </w:p>
+    <w:p>
+      <w:pPr>
+        <w:pStyle w:val="BodyText"/>
+      </w:pPr>
+      <w:r>
+        <w:rPr>
+          <w:b/>
+          <w:bCs/>
+        </w:rPr>
+        <w:t xml:space="preserve">The witness hunt.</w:t>
+      </w:r>
+      <w:r>
+        <w:t xml:space="preserve"> </w:t>
+      </w:r>
+      <w:r>
+        <w:t xml:space="preserve">Each missing work now carries its lead:</w:t>
+      </w:r>
+      <w:r>
+        <w:t xml:space="preserve"> </w:t>
+      </w:r>
+      <w:r>
+        <w:rPr>
+          <w:b/>
+          <w:bCs/>
+        </w:rPr>
+        <w:t xml:space="preserve">scans on BDRC</w:t>
+      </w:r>
+      <w:r>
+        <w:t xml:space="preserve"> </w:t>
+      </w:r>
+      <w:r>
+        <w:t xml:space="preserve">when the number maps deterministically (KD/KL/TD</w:t>
+      </w:r>
+      <w:r>
+        <w:t xml:space="preserve"> </w:t>
+      </w:r>
+      <w:r>
+        <w:t xml:space="preserve">are Tohoku numbers), otherwise</w:t>
+      </w:r>
+      <w:r>
+        <w:t xml:space="preserve"> </w:t>
+      </w:r>
+      <w:r>
+        <w:rPr>
+          <w:b/>
+          <w:bCs/>
+        </w:rPr>
+        <w:t xml:space="preserve">search BUDA</w:t>
+      </w:r>
+      <w:r>
+        <w:t xml:space="preserve"> </w:t>
+      </w:r>
+      <w:r>
+        <w:t xml:space="preserve">— a title search</w:t>
+      </w:r>
+      <w:r>
+        <w:t xml:space="preserve"> </w:t>
+      </w:r>
+      <w:r>
+        <w:t xml:space="preserve">built from the citation’s own Tibetan span (measured: 45 of the 50</w:t>
+      </w:r>
+      <w:r>
+        <w:t xml:space="preserve"> </w:t>
+      </w:r>
+      <w:r>
+        <w:t xml:space="preserve">missing works yield a query from their citation).</w:t>
+      </w:r>
+      <w:r>
+        <w:t xml:space="preserve"> </w:t>
+      </w:r>
+      <w:r>
+        <w:rPr>
+          <w:b/>
+          <w:bCs/>
+        </w:rPr>
+        <w:t xml:space="preserve">Export missing</w:t>
+      </w:r>
+      <w:r>
+        <w:rPr>
+          <w:b/>
+          <w:bCs/>
+        </w:rPr>
+        <w:t xml:space="preserve"> </w:t>
+      </w:r>
+      <w:r>
+        <w:rPr>
+          <w:b/>
+          <w:bCs/>
+        </w:rPr>
+        <w:t xml:space="preserve">list…</w:t>
+      </w:r>
+      <w:r>
+        <w:t xml:space="preserve"> </w:t>
+      </w:r>
+      <w:r>
+        <w:t xml:space="preserve">writes the field-coded handout for the hunt — number,</w:t>
+      </w:r>
+      <w:r>
+        <w:t xml:space="preserve"> </w:t>
+      </w:r>
+      <w:r>
+        <w:t xml:space="preserve">citing volume, citation, search link — the sheet a session hands</w:t>
+      </w:r>
+      <w:r>
+        <w:t xml:space="preserve"> </w:t>
+      </w:r>
+      <w:r>
+        <w:t xml:space="preserve">to whoever is asked to check.</w:t>
       </w:r>
     </w:p>
     <w:bookmarkEnd w:id="121"/>

</xml_diff>

<commit_message>
Loop 19 — worksheet enrichment ships: MD5, folios, BDRC permalink
Phase-3 item 19. The worksheet's prefill now answers what the
live sheet's own columns ask for: "Byte Count (MD5 Checksum)"
carries both the size and the MD5; "ALL/BDRC Volume ID & Folio
Count" gets the folio range read from the text's own @-marks (the
folio-range helper promoted to the public core API with its own
pins); "BDRC Permalink" fills via the verified deterministic
Tohoku mapping for KD/KL/TD works (library.bdrc.io/show/bdr:MW…).

Strengthened selftest pin on a KD probe proves all three prefills
land alongside number/Tohoku/title/colophon. ctest 55/55. Manual
14.16 extended.

Co-Authored-By: Claude Opus 5 (1M context) <noreply@anthropic.com>
</commit_message>
<xml_diff>
--- a/docs/distribution/USER_MANUAL.docx
+++ b/docs/distribution/USER_MANUAL.docx
@@ -33887,7 +33887,83 @@
         <w:t xml:space="preserve"> </w:t>
       </w:r>
       <w:r>
-        <w:t xml:space="preserve">itself, the first composition-colophon candidate, the byte count.</w:t>
+        <w:t xml:space="preserve">itself, the first composition-colophon candidate, the byte count</w:t>
+      </w:r>
+      <w:r>
+        <w:t xml:space="preserve"> </w:t>
+      </w:r>
+      <w:r>
+        <w:rPr>
+          <w:b/>
+          <w:bCs/>
+        </w:rPr>
+        <w:t xml:space="preserve">with its MD5 checksum</w:t>
+      </w:r>
+      <w:r>
+        <w:t xml:space="preserve"> </w:t>
+      </w:r>
+      <w:r>
+        <w:t xml:space="preserve">(the column asks for both), the</w:t>
+      </w:r>
+      <w:r>
+        <w:t xml:space="preserve"> </w:t>
+      </w:r>
+      <w:r>
+        <w:rPr>
+          <w:b/>
+          <w:bCs/>
+        </w:rPr>
+        <w:t xml:space="preserve">folio</w:t>
+      </w:r>
+      <w:r>
+        <w:rPr>
+          <w:b/>
+          <w:bCs/>
+        </w:rPr>
+        <w:t xml:space="preserve"> </w:t>
+      </w:r>
+      <w:r>
+        <w:rPr>
+          <w:b/>
+          <w:bCs/>
+        </w:rPr>
+        <w:t xml:space="preserve">range</w:t>
+      </w:r>
+      <w:r>
+        <w:t xml:space="preserve"> </w:t>
+      </w:r>
+      <w:r>
+        <w:t xml:space="preserve">read from the text’s own @-marks, and the</w:t>
+      </w:r>
+      <w:r>
+        <w:t xml:space="preserve"> </w:t>
+      </w:r>
+      <w:r>
+        <w:rPr>
+          <w:b/>
+          <w:bCs/>
+        </w:rPr>
+        <w:t xml:space="preserve">BDRC</w:t>
+      </w:r>
+      <w:r>
+        <w:rPr>
+          <w:b/>
+          <w:bCs/>
+        </w:rPr>
+        <w:t xml:space="preserve"> </w:t>
+      </w:r>
+      <w:r>
+        <w:rPr>
+          <w:b/>
+          <w:bCs/>
+        </w:rPr>
+        <w:t xml:space="preserve">permalink</w:t>
+      </w:r>
+      <w:r>
+        <w:t xml:space="preserve"> </w:t>
+      </w:r>
+      <w:r>
+        <w:t xml:space="preserve">where the number maps deterministically (KD/KL/TD).</w:t>
       </w:r>
       <w:r>
         <w:t xml:space="preserve"> </w:t>

</xml_diff>

<commit_message>
Audit findings D3/D4/D6 closed: the manual's last drift fixed
D3's residue: the two remaining "Input → Scan" path references
become "Input → OCR" (the pane's real tab). D4's residue: the
proposal-kinds passage now states the form/channel split honestly
— the form offers ten kinds, two more ride the channel from
elsewhere (Overlay spelling flags, Catalog identity proposals).
D6's stale Files-chapter footer was verified already gone. All
three findings marked CLOSED in the audit document with dates.

With D1-D6 and C1-C2 closed, the 2026-08-18 functional audit's
documentation findings are fully resolved; C3 (tooltip shortcuts)
stays in the idea bank as designed. ctest 55/55.

Co-Authored-By: Claude Opus 5 (1M context) <noreply@anthropic.com>
</commit_message>
<xml_diff>
--- a/docs/distribution/USER_MANUAL.docx
+++ b/docs/distribution/USER_MANUAL.docx
@@ -24584,7 +24584,7 @@
         <w:t xml:space="preserve"> </w:t>
       </w:r>
       <w:r>
-        <w:t xml:space="preserve">“Input → Scan”</w:t>
+        <w:t xml:space="preserve">“Input → OCR”</w:t>
       </w:r>
       <w:r>
         <w:t xml:space="preserve"> </w:t>
@@ -24622,7 +24622,7 @@
           <w:b/>
           <w:bCs/>
         </w:rPr>
-        <w:t xml:space="preserve">Scan</w:t>
+        <w:t xml:space="preserve">OCR</w:t>
       </w:r>
       <w:r>
         <w:t xml:space="preserve"> </w:t>
@@ -28709,7 +28709,7 @@
           <w:b/>
           <w:bCs/>
         </w:rPr>
-        <w:t xml:space="preserve">Input → Scan</w:t>
+        <w:t xml:space="preserve">Input → OCR</w:t>
       </w:r>
       <w:r>
         <w:t xml:space="preserve">.</w:t>
@@ -35379,7 +35379,25 @@
         <w:t xml:space="preserve"> </w:t>
       </w:r>
       <w:r>
-        <w:t xml:space="preserve">The ten kinds, and what each means:</w:t>
+        <w:t xml:space="preserve">The form offers ten kinds (two more ride the channel from</w:t>
+      </w:r>
+      <w:r>
+        <w:t xml:space="preserve"> </w:t>
+      </w:r>
+      <w:r>
+        <w:t xml:space="preserve">elsewhere: spelling flags filed by the Overlay’s doubt marks,</w:t>
+      </w:r>
+      <w:r>
+        <w:t xml:space="preserve"> </w:t>
+      </w:r>
+      <w:r>
+        <w:t xml:space="preserve">and catalog identities filed from the Catalog pane’s</w:t>
+      </w:r>
+      <w:r>
+        <w:t xml:space="preserve"> </w:t>
+      </w:r>
+      <w:r>
+        <w:t xml:space="preserve">suggested-identity card). The ten, and what each means:</w:t>
       </w:r>
     </w:p>
     <w:p>

</xml_diff>

<commit_message>
Library gains a visible Survey button (audit C1's queued follow-up)
The Translator's survey had climbed from one-broken-link-from-
invisible (the C1 finding) to a Maintenance menu entry; it now has
a visible button in the Library's control row too. One shared
handler (surveySelected) serves the button, the menu entry, and
keeps the honest no-selection message. Sweep exercises the button
(9 Library controls); manual names all three ways in; the audit's
queued item is closed. ctest 55/55.

Co-Authored-By: Claude Opus 5 (1M context) <noreply@anthropic.com>
</commit_message>
<xml_diff>
--- a/docs/distribution/USER_MANUAL.docx
+++ b/docs/distribution/USER_MANUAL.docx
@@ -9573,7 +9573,56 @@
         <w:pStyle w:val="FirstParagraph"/>
       </w:pPr>
       <w:r>
-        <w:t xml:space="preserve">The info panel’s</w:t>
+        <w:t xml:space="preserve">Three ways in: the visible</w:t>
+      </w:r>
+      <w:r>
+        <w:t xml:space="preserve"> </w:t>
+      </w:r>
+      <w:r>
+        <w:rPr>
+          <w:b/>
+          <w:bCs/>
+        </w:rPr>
+        <w:t xml:space="preserve">Survey…</w:t>
+      </w:r>
+      <w:r>
+        <w:t xml:space="preserve"> </w:t>
+      </w:r>
+      <w:r>
+        <w:t xml:space="preserve">button in the Library’s</w:t>
+      </w:r>
+      <w:r>
+        <w:t xml:space="preserve"> </w:t>
+      </w:r>
+      <w:r>
+        <w:t xml:space="preserve">control row,</w:t>
+      </w:r>
+      <w:r>
+        <w:t xml:space="preserve"> </w:t>
+      </w:r>
+      <w:r>
+        <w:rPr>
+          <w:b/>
+          <w:bCs/>
+        </w:rPr>
+        <w:t xml:space="preserve">Maintenance… → Translator’s survey (selected</w:t>
+      </w:r>
+      <w:r>
+        <w:rPr>
+          <w:b/>
+          <w:bCs/>
+        </w:rPr>
+        <w:t xml:space="preserve"> </w:t>
+      </w:r>
+      <w:r>
+        <w:rPr>
+          <w:b/>
+          <w:bCs/>
+        </w:rPr>
+        <w:t xml:space="preserve">text)</w:t>
+      </w:r>
+      <w:r>
+        <w:t xml:space="preserve">, and the info panel’s</w:t>
       </w:r>
       <w:r>
         <w:t xml:space="preserve"> </w:t>
@@ -9589,7 +9638,13 @@
         <w:t xml:space="preserve"> </w:t>
       </w:r>
       <w:r>
-        <w:t xml:space="preserve">link answers the</w:t>
+        <w:t xml:space="preserve">link — all</w:t>
+      </w:r>
+      <w:r>
+        <w:t xml:space="preserve"> </w:t>
+      </w:r>
+      <w:r>
+        <w:t xml:space="preserve">three read the selected text. The survey answers the</w:t>
       </w:r>
       <w:r>
         <w:t xml:space="preserve"> </w:t>

</xml_diff>

<commit_message>
Hunt Everywhere gains the persons lane (wow-list item closed)
Type any part of an author's name into ⌘K — the ACIP form, an
anglicized fragment, or a BDRC name variant — and the authors
layer answers: 👤 rows with dates and catalog work counts, Enter
opening the person's BDRC page (Treasury of Lives noted where
linked). The same query surfaces the author's works through the
existing file lane, so person and works arrive together. Data:
the banked persons_bdrc.json (183 authors), loaded lazily.

The palette's selftest grows a fifth check (Gö Lotsawa reaches
the authors layer); the manual's lane list gains persons and the
previously undocumented apparatus lane. With the apparatus/notes
lane already shipped on 08-16, the wow-list's "⌘K persons/notes
lanes" item is closed. ctest 55/55.

Co-Authored-By: Claude Opus 5 (1M context) <noreply@anthropic.com>
</commit_message>
<xml_diff>
--- a/docs/distribution/USER_MANUAL.docx
+++ b/docs/distribution/USER_MANUAL.docx
@@ -40920,6 +40920,96 @@
       </w:r>
       <w:r>
         <w:t xml:space="preserve">rows that open the recording at the timecode;</w:t>
+      </w:r>
+    </w:p>
+    <w:p>
+      <w:pPr>
+        <w:pStyle w:val="Compact"/>
+        <w:numPr>
+          <w:ilvl w:val="0"/>
+          <w:numId w:val="1119"/>
+        </w:numPr>
+      </w:pPr>
+      <w:r>
+        <w:rPr>
+          <w:b/>
+          <w:bCs/>
+        </w:rPr>
+        <w:t xml:space="preserve">📎 apparatus</w:t>
+      </w:r>
+      <w:r>
+        <w:t xml:space="preserve"> </w:t>
+      </w:r>
+      <w:r>
+        <w:t xml:space="preserve">rows — the published footnotes and</w:t>
+      </w:r>
+      <w:r>
+        <w:t xml:space="preserve"> </w:t>
+      </w:r>
+      <w:r>
+        <w:t xml:space="preserve">bibliography entries;</w:t>
+      </w:r>
+    </w:p>
+    <w:p>
+      <w:pPr>
+        <w:pStyle w:val="Compact"/>
+        <w:numPr>
+          <w:ilvl w:val="0"/>
+          <w:numId w:val="1119"/>
+        </w:numPr>
+      </w:pPr>
+      <w:r>
+        <w:rPr>
+          <w:b/>
+          <w:bCs/>
+        </w:rPr>
+        <w:t xml:space="preserve">👤 person</w:t>
+      </w:r>
+      <w:r>
+        <w:t xml:space="preserve"> </w:t>
+      </w:r>
+      <w:r>
+        <w:t xml:space="preserve">rows — the authors layer: type any part of a</w:t>
+      </w:r>
+      <w:r>
+        <w:t xml:space="preserve"> </w:t>
+      </w:r>
+      <w:r>
+        <w:t xml:space="preserve">name (</w:t>
+      </w:r>
+      <w:r>
+        <w:rPr>
+          <w:i/>
+          <w:iCs/>
+        </w:rPr>
+        <w:t xml:space="preserve">gzhon nu dpal</w:t>
+      </w:r>
+      <w:r>
+        <w:t xml:space="preserve">, an anglicized fragment, a BDRC variant)</w:t>
+      </w:r>
+      <w:r>
+        <w:t xml:space="preserve"> </w:t>
+      </w:r>
+      <w:r>
+        <w:t xml:space="preserve">and matching authors appear with their dates and catalog work</w:t>
+      </w:r>
+      <w:r>
+        <w:t xml:space="preserve"> </w:t>
+      </w:r>
+      <w:r>
+        <w:t xml:space="preserve">count; Enter opens the person’s BDRC page (with Treasury of</w:t>
+      </w:r>
+      <w:r>
+        <w:t xml:space="preserve"> </w:t>
+      </w:r>
+      <w:r>
+        <w:t xml:space="preserve">Lives where linked). Their works surface right below through</w:t>
+      </w:r>
+      <w:r>
+        <w:t xml:space="preserve"> </w:t>
+      </w:r>
+      <w:r>
+        <w:t xml:space="preserve">the file lane — the same query finds both;</w:t>
       </w:r>
     </w:p>
     <w:p>

</xml_diff>

<commit_message>
Apparatus anchors route 4: 252 of 2,234 footnotes now carry their Tibetan
Adam's ask (2026-08-15) advances: lemmas resolved through HGM's own
reverse index with a gloss-equality gate - a footnote anchors only
when its lemma is EXACTLY one of an entry's own hgm_glosses, so every
candidate is HGM's own English equivalence (rule 1 by construction).
Tier discipline caps the attention spend: curated/glossary preferred,
auto-aligned only when nothing better answered, max 3, labeled
PROVISIONAL. +134 notes over route 3's 117; generator banked as
tools/build_apparatus_anchors_r4.py (route 3's never was - gap noted).
Pane label now covers both methods; evidence sentences render without
excerpt ellipses; selftest floor 240 + route-4 render pinned. Manual
gains the missing Apparatus-pane section. Routes 1+2 stay open.

Co-Authored-By: Claude Fable 5 <noreply@anthropic.com>
</commit_message>
<xml_diff>
--- a/docs/distribution/USER_MANUAL.docx
+++ b/docs/distribution/USER_MANUAL.docx
@@ -1102,7 +1102,7 @@
     </w:p>
     <w:bookmarkEnd w:id="9"/>
     <w:bookmarkEnd w:id="10"/>
-    <w:bookmarkStart w:id="70" w:name="part-one-read-translate"/>
+    <w:bookmarkStart w:id="71" w:name="part-one-read-translate"/>
     <w:p>
       <w:pPr>
         <w:pStyle w:val="Heading1"/>
@@ -12631,7 +12631,7 @@
     </w:p>
     <w:bookmarkEnd w:id="51"/>
     <w:bookmarkEnd w:id="52"/>
-    <w:bookmarkStart w:id="61" w:name="draft"/>
+    <w:bookmarkStart w:id="62" w:name="draft"/>
     <w:p>
       <w:pPr>
         <w:pStyle w:val="Heading2"/>
@@ -14555,8 +14555,165 @@
       </w:r>
     </w:p>
     <w:bookmarkEnd w:id="60"/>
+    <w:bookmarkStart w:id="61" w:name="Xd7c0ea1706c22788b77acab58342a3ab578cff8"/>
+    <w:p>
+      <w:pPr>
+        <w:pStyle w:val="Heading3"/>
+      </w:pPr>
+      <w:r>
+        <w:t xml:space="preserve">The Apparatus pane — the published bank itself</w:t>
+      </w:r>
+    </w:p>
+    <w:p>
+      <w:pPr>
+        <w:pStyle w:val="FirstParagraph"/>
+      </w:pPr>
+      <w:r>
+        <w:t xml:space="preserve">The</w:t>
+      </w:r>
+      <w:r>
+        <w:t xml:space="preserve"> </w:t>
+      </w:r>
+      <w:r>
+        <w:rPr>
+          <w:b/>
+          <w:bCs/>
+        </w:rPr>
+        <w:t xml:space="preserve">Apparatus</w:t>
+      </w:r>
+      <w:r>
+        <w:t xml:space="preserve"> </w:t>
+      </w:r>
+      <w:r>
+        <w:t xml:space="preserve">pane (same Translate group) is the bank the</w:t>
+      </w:r>
+      <w:r>
+        <w:t xml:space="preserve"> </w:t>
+      </w:r>
+      <w:r>
+        <w:t xml:space="preserve">search box reaches: all 2,234 published footnotes and the</w:t>
+      </w:r>
+      <w:r>
+        <w:t xml:space="preserve"> </w:t>
+      </w:r>
+      <w:r>
+        <w:t xml:space="preserve">bibliography, scrollable and searchable, official tier only —</w:t>
+      </w:r>
+      <w:r>
+        <w:t xml:space="preserve"> </w:t>
+      </w:r>
+      <w:r>
+        <w:t xml:space="preserve">what shipped in the released volumes, nothing pending.</w:t>
+      </w:r>
+    </w:p>
+    <w:p>
+      <w:pPr>
+        <w:pStyle w:val="BodyText"/>
+      </w:pPr>
+      <w:r>
+        <w:t xml:space="preserve">Under a footnote’s text you may see</w:t>
+      </w:r>
+      <w:r>
+        <w:t xml:space="preserve"> </w:t>
+      </w:r>
+      <w:r>
+        <w:rPr>
+          <w:b/>
+          <w:bCs/>
+        </w:rPr>
+        <w:t xml:space="preserve">TIBETAN NAMED IN THIS</w:t>
+      </w:r>
+      <w:r>
+        <w:rPr>
+          <w:b/>
+          <w:bCs/>
+        </w:rPr>
+        <w:t xml:space="preserve"> </w:t>
+      </w:r>
+      <w:r>
+        <w:rPr>
+          <w:b/>
+          <w:bCs/>
+        </w:rPr>
+        <w:t xml:space="preserve">NOTE</w:t>
+      </w:r>
+      <w:r>
+        <w:t xml:space="preserve"> </w:t>
+      </w:r>
+      <w:r>
+        <w:t xml:space="preserve">— the Tibetan term(s) the note is talking about, each in</w:t>
+      </w:r>
+      <w:r>
+        <w:t xml:space="preserve"> </w:t>
+      </w:r>
+      <w:r>
+        <w:t xml:space="preserve">Tibetan script with its wylie and the evidence it was located</w:t>
+      </w:r>
+      <w:r>
+        <w:t xml:space="preserve"> </w:t>
+      </w:r>
+      <w:r>
+        <w:t xml:space="preserve">from. These are</w:t>
+      </w:r>
+      <w:r>
+        <w:t xml:space="preserve"> </w:t>
+      </w:r>
+      <w:r>
+        <w:rPr>
+          <w:b/>
+          <w:bCs/>
+        </w:rPr>
+        <w:t xml:space="preserve">machine-located candidates, never a ruling</w:t>
+      </w:r>
+      <w:r>
+        <w:t xml:space="preserve">:</w:t>
+      </w:r>
+      <w:r>
+        <w:t xml:space="preserve"> </w:t>
+      </w:r>
+      <w:r>
+        <w:t xml:space="preserve">either the note itself quotes the Tibetan in its own body (the</w:t>
+      </w:r>
+      <w:r>
+        <w:t xml:space="preserve"> </w:t>
+      </w:r>
+      <w:r>
+        <w:t xml:space="preserve">evidence line shows that sentence), or — added 2026-08-20 —</w:t>
+      </w:r>
+      <w:r>
+        <w:t xml:space="preserve"> </w:t>
+      </w:r>
+      <w:r>
+        <w:t xml:space="preserve">Geshe Michael’s own English equivalent for a dictionary entry is</w:t>
+      </w:r>
+      <w:r>
+        <w:t xml:space="preserve"> </w:t>
+      </w:r>
+      <w:r>
+        <w:t xml:space="preserve">exactly this footnote’s lemma (the evidence names the gloss, its</w:t>
+      </w:r>
+      <w:r>
+        <w:t xml:space="preserve"> </w:t>
+      </w:r>
+      <w:r>
+        <w:t xml:space="preserve">tier, and marks PROVISIONAL tiers plainly). 252 of the 2,234</w:t>
+      </w:r>
+      <w:r>
+        <w:t xml:space="preserve"> </w:t>
+      </w:r>
+      <w:r>
+        <w:t xml:space="preserve">notes carry such candidates today; the rest stay honestly bare</w:t>
+      </w:r>
+      <w:r>
+        <w:t xml:space="preserve"> </w:t>
+      </w:r>
+      <w:r>
+        <w:t xml:space="preserve">rather than guessed at.</w:t>
+      </w:r>
+    </w:p>
     <w:bookmarkEnd w:id="61"/>
-    <w:bookmarkStart w:id="64" w:name="review"/>
+    <w:bookmarkEnd w:id="62"/>
+    <w:bookmarkStart w:id="65" w:name="review"/>
     <w:p>
       <w:pPr>
         <w:pStyle w:val="Heading2"/>
@@ -14591,7 +14748,7 @@
         <w:t xml:space="preserve">translator checking someone else’s finished draft.</w:t>
       </w:r>
     </w:p>
-    <w:bookmarkStart w:id="62" w:name="running-a-review"/>
+    <w:bookmarkStart w:id="63" w:name="running-a-review"/>
     <w:p>
       <w:pPr>
         <w:pStyle w:val="Heading3"/>
@@ -14729,8 +14886,8 @@
         <w:t xml:space="preserve">guides; you decide.</w:t>
       </w:r>
     </w:p>
-    <w:bookmarkEnd w:id="62"/>
-    <w:bookmarkStart w:id="63" w:name="reading-each-advisory-type"/>
+    <w:bookmarkEnd w:id="63"/>
+    <w:bookmarkStart w:id="64" w:name="reading-each-advisory-type"/>
     <w:p>
       <w:pPr>
         <w:pStyle w:val="Heading3"/>
@@ -15242,9 +15399,9 @@
         <w:t xml:space="preserve">you for any passage you want to see in context.</w:t>
       </w:r>
     </w:p>
-    <w:bookmarkEnd w:id="63"/>
     <w:bookmarkEnd w:id="64"/>
-    <w:bookmarkStart w:id="69" w:name="align"/>
+    <w:bookmarkEnd w:id="65"/>
+    <w:bookmarkStart w:id="70" w:name="align"/>
     <w:p>
       <w:pPr>
         <w:pStyle w:val="Heading2"/>
@@ -15307,7 +15464,7 @@
         <w:t xml:space="preserve">translator-authored word pairs.</w:t>
       </w:r>
     </w:p>
-    <w:bookmarkStart w:id="65" w:name="the-layout-4"/>
+    <w:bookmarkStart w:id="66" w:name="the-layout-4"/>
     <w:p>
       <w:pPr>
         <w:pStyle w:val="Heading3"/>
@@ -15336,8 +15493,8 @@
         <w:t xml:space="preserve">list showing every link made so far.</w:t>
       </w:r>
     </w:p>
-    <w:bookmarkEnd w:id="65"/>
-    <w:bookmarkStart w:id="66" w:name="loading-the-two-sides"/>
+    <w:bookmarkEnd w:id="66"/>
+    <w:bookmarkStart w:id="67" w:name="loading-the-two-sides"/>
     <w:p>
       <w:pPr>
         <w:pStyle w:val="Heading3"/>
@@ -15445,8 +15602,8 @@
         <w:t xml:space="preserve">so you can stop and resume across sessions.</w:t>
       </w:r>
     </w:p>
-    <w:bookmarkEnd w:id="66"/>
-    <w:bookmarkStart w:id="67" w:name="making-links"/>
+    <w:bookmarkEnd w:id="67"/>
+    <w:bookmarkStart w:id="68" w:name="making-links"/>
     <w:p>
       <w:pPr>
         <w:pStyle w:val="Heading3"/>
@@ -15860,8 +16017,8 @@
         <w:t xml:space="preserve">and the inner links nest green inside it.</w:t>
       </w:r>
     </w:p>
-    <w:bookmarkEnd w:id="67"/>
-    <w:bookmarkStart w:id="68" w:name="import-and-export"/>
+    <w:bookmarkEnd w:id="68"/>
+    <w:bookmarkStart w:id="69" w:name="import-and-export"/>
     <w:p>
       <w:pPr>
         <w:pStyle w:val="Heading3"/>
@@ -15978,10 +16135,10 @@
         <w:t xml:space="preserve">admits.</w:t>
       </w:r>
     </w:p>
-    <w:bookmarkEnd w:id="68"/>
     <w:bookmarkEnd w:id="69"/>
     <w:bookmarkEnd w:id="70"/>
-    <w:bookmarkStart w:id="98" w:name="part-two-research-learn"/>
+    <w:bookmarkEnd w:id="71"/>
+    <w:bookmarkStart w:id="99" w:name="part-two-research-learn"/>
     <w:p>
       <w:pPr>
         <w:pStyle w:val="Heading1"/>
@@ -16163,7 +16320,7 @@
         </w:pict>
       </w:r>
     </w:p>
-    <w:bookmarkStart w:id="76" w:name="search-gofer"/>
+    <w:bookmarkStart w:id="77" w:name="search-gofer"/>
     <w:p>
       <w:pPr>
         <w:pStyle w:val="Heading2"/>
@@ -16278,7 +16435,7 @@
         <w:t xml:space="preserve">— where the hits appear.</w:t>
       </w:r>
     </w:p>
-    <w:bookmarkStart w:id="71" w:name="the-search-setting-tab-top-to-bottom"/>
+    <w:bookmarkStart w:id="72" w:name="the-search-setting-tab-top-to-bottom"/>
     <w:p>
       <w:pPr>
         <w:pStyle w:val="Heading3"/>
@@ -16854,8 +17011,8 @@
         <w:t xml:space="preserve">interrupts a long folder search.</w:t>
       </w:r>
     </w:p>
-    <w:bookmarkEnd w:id="71"/>
-    <w:bookmarkStart w:id="72" w:name="worked-example-two-terms-near-each-other"/>
+    <w:bookmarkEnd w:id="72"/>
+    <w:bookmarkStart w:id="73" w:name="worked-example-two-terms-near-each-other"/>
     <w:p>
       <w:pPr>
         <w:pStyle w:val="Heading3"/>
@@ -17516,8 +17673,8 @@
         <w:t xml:space="preserve">same text, at any distance.</w:t>
       </w:r>
     </w:p>
-    <w:bookmarkEnd w:id="72"/>
-    <w:bookmarkStart w:id="73" w:name="saving-a-search-and-the-saved-search-tab"/>
+    <w:bookmarkEnd w:id="73"/>
+    <w:bookmarkStart w:id="74" w:name="saving-a-search-and-the-saved-search-tab"/>
     <w:p>
       <w:pPr>
         <w:pStyle w:val="Heading3"/>
@@ -17694,8 +17851,8 @@
         <w:t xml:space="preserve">saved search. Saved searches persist across restarts.</w:t>
       </w:r>
     </w:p>
-    <w:bookmarkEnd w:id="73"/>
-    <w:bookmarkStart w:id="74" w:name="the-citation-web"/>
+    <w:bookmarkEnd w:id="74"/>
+    <w:bookmarkStart w:id="75" w:name="the-citation-web"/>
     <w:p>
       <w:pPr>
         <w:pStyle w:val="Heading3"/>
@@ -17770,8 +17927,8 @@
         <w:t xml:space="preserve">root text, a prayer book and the sadhana it feeds.</w:t>
       </w:r>
     </w:p>
-    <w:bookmarkEnd w:id="74"/>
-    <w:bookmarkStart w:id="75" w:name="X8710ea58633d2f50b4710084158e84b13ea90ce"/>
+    <w:bookmarkEnd w:id="75"/>
+    <w:bookmarkStart w:id="76" w:name="X8710ea58633d2f50b4710084158e84b13ea90ce"/>
     <w:p>
       <w:pPr>
         <w:pStyle w:val="Heading3"/>
@@ -17982,9 +18139,9 @@
         </w:pict>
       </w:r>
     </w:p>
-    <w:bookmarkEnd w:id="75"/>
     <w:bookmarkEnd w:id="76"/>
-    <w:bookmarkStart w:id="80" w:name="lookup"/>
+    <w:bookmarkEnd w:id="77"/>
+    <w:bookmarkStart w:id="81" w:name="lookup"/>
     <w:p>
       <w:pPr>
         <w:pStyle w:val="Heading2"/>
@@ -18033,7 +18190,7 @@
         <w:t xml:space="preserve">area. On the left: the Tibetan-order browser (below).</w:t>
       </w:r>
     </w:p>
-    <w:bookmarkStart w:id="77" w:name="looking-a-word-up-every-input-form"/>
+    <w:bookmarkStart w:id="78" w:name="looking-a-word-up-every-input-form"/>
     <w:p>
       <w:pPr>
         <w:pStyle w:val="Heading3"/>
@@ -18743,8 +18900,8 @@
         <w:t xml:space="preserve">the note is always there.</w:t>
       </w:r>
     </w:p>
-    <w:bookmarkEnd w:id="77"/>
-    <w:bookmarkStart w:id="78" w:name="reading-a-result-card"/>
+    <w:bookmarkEnd w:id="78"/>
+    <w:bookmarkStart w:id="79" w:name="reading-a-result-card"/>
     <w:p>
       <w:pPr>
         <w:pStyle w:val="Heading3"/>
@@ -19638,8 +19795,8 @@
         <w:t xml:space="preserve">official data without the authority’s ruling.</w:t>
       </w:r>
     </w:p>
-    <w:bookmarkEnd w:id="78"/>
-    <w:bookmarkStart w:id="79" w:name="browsing-in-tibetan-order"/>
+    <w:bookmarkEnd w:id="79"/>
+    <w:bookmarkStart w:id="80" w:name="browsing-in-tibetan-order"/>
     <w:p>
       <w:pPr>
         <w:pStyle w:val="Heading3"/>
@@ -19844,9 +20001,9 @@
         <w:t xml:space="preserve">redistributed.</w:t>
       </w:r>
     </w:p>
-    <w:bookmarkEnd w:id="79"/>
     <w:bookmarkEnd w:id="80"/>
-    <w:bookmarkStart w:id="83" w:name="sanskrit"/>
+    <w:bookmarkEnd w:id="81"/>
+    <w:bookmarkStart w:id="84" w:name="sanskrit"/>
     <w:p>
       <w:pPr>
         <w:pStyle w:val="Heading2"/>
@@ -19895,7 +20052,7 @@
         <w:t xml:space="preserve">classical Tibetan.</w:t>
       </w:r>
     </w:p>
-    <w:bookmarkStart w:id="81" w:name="the-input-and-the-analyze-cascade"/>
+    <w:bookmarkStart w:id="82" w:name="the-input-and-the-analyze-cascade"/>
     <w:p>
       <w:pPr>
         <w:pStyle w:val="Heading3"/>
@@ -20666,8 +20823,8 @@
         <w:t xml:space="preserve">the term. A link only; nothing ingested.</w:t>
       </w:r>
     </w:p>
-    <w:bookmarkEnd w:id="81"/>
-    <w:bookmarkStart w:id="82" w:name="sanskrit-ocr"/>
+    <w:bookmarkEnd w:id="82"/>
+    <w:bookmarkStart w:id="83" w:name="sanskrit-ocr"/>
     <w:p>
       <w:pPr>
         <w:pStyle w:val="Heading3"/>
@@ -20834,9 +20991,9 @@
         </w:pict>
       </w:r>
     </w:p>
-    <w:bookmarkEnd w:id="82"/>
     <w:bookmarkEnd w:id="83"/>
-    <w:bookmarkStart w:id="86" w:name="convert"/>
+    <w:bookmarkEnd w:id="84"/>
+    <w:bookmarkStart w:id="87" w:name="convert"/>
     <w:p>
       <w:pPr>
         <w:pStyle w:val="Heading2"/>
@@ -20857,7 +21014,7 @@
         <w:t xml:space="preserve">Research → Convert. Every writing system, and time itself.</w:t>
       </w:r>
     </w:p>
-    <w:bookmarkStart w:id="84" w:name="Xfee2202bec075b0087386cc9bf4154f86663279"/>
+    <w:bookmarkStart w:id="85" w:name="Xfee2202bec075b0087386cc9bf4154f86663279"/>
     <w:p>
       <w:pPr>
         <w:pStyle w:val="Heading3"/>
@@ -21249,8 +21406,8 @@
         <w:t xml:space="preserve">everything it recognizes.</w:t>
       </w:r>
     </w:p>
-    <w:bookmarkEnd w:id="84"/>
-    <w:bookmarkStart w:id="85" w:name="Xa675b90fe9bd6cb991af96d422c9161823b68c6"/>
+    <w:bookmarkEnd w:id="85"/>
+    <w:bookmarkStart w:id="86" w:name="Xa675b90fe9bd6cb991af96d422c9161823b68c6"/>
     <w:p>
       <w:pPr>
         <w:pStyle w:val="Heading3"/>
@@ -22009,9 +22166,9 @@
         <w:t xml:space="preserve">converter never sees them.</w:t>
       </w:r>
     </w:p>
-    <w:bookmarkEnd w:id="85"/>
     <w:bookmarkEnd w:id="86"/>
-    <w:bookmarkStart w:id="91" w:name="analysis"/>
+    <w:bookmarkEnd w:id="87"/>
+    <w:bookmarkStart w:id="92" w:name="analysis"/>
     <w:p>
       <w:pPr>
         <w:pStyle w:val="Heading2"/>
@@ -22088,7 +22245,7 @@
         <w:t xml:space="preserve">runs fully offline.</w:t>
       </w:r>
     </w:p>
-    <w:bookmarkStart w:id="87" w:name="what-it-is-and-what-it-costs"/>
+    <w:bookmarkStart w:id="88" w:name="what-it-is-and-what-it-costs"/>
     <w:p>
       <w:pPr>
         <w:pStyle w:val="Heading3"/>
@@ -22278,8 +22435,8 @@
         <w:t xml:space="preserve">).</w:t>
       </w:r>
     </w:p>
-    <w:bookmarkEnd w:id="87"/>
-    <w:bookmarkStart w:id="88" w:name="running-an-analysis"/>
+    <w:bookmarkEnd w:id="88"/>
+    <w:bookmarkStart w:id="89" w:name="running-an-analysis"/>
     <w:p>
       <w:pPr>
         <w:pStyle w:val="Heading3"/>
@@ -22456,8 +22613,8 @@
         <w:t xml:space="preserve">it is written.</w:t>
       </w:r>
     </w:p>
-    <w:bookmarkEnd w:id="88"/>
-    <w:bookmarkStart w:id="89" w:name="the-eighteen-sections"/>
+    <w:bookmarkEnd w:id="89"/>
+    <w:bookmarkStart w:id="90" w:name="the-eighteen-sections"/>
     <w:p>
       <w:pPr>
         <w:pStyle w:val="Heading3"/>
@@ -22738,8 +22895,8 @@
         <w:t xml:space="preserve">may match the master’s English, never compose it in his name.</w:t>
       </w:r>
     </w:p>
-    <w:bookmarkEnd w:id="89"/>
-    <w:bookmarkStart w:id="90" w:name="the-qc-panel-and-saving"/>
+    <w:bookmarkEnd w:id="90"/>
+    <w:bookmarkStart w:id="91" w:name="the-qc-panel-and-saving"/>
     <w:p>
       <w:pPr>
         <w:pStyle w:val="Heading3"/>
@@ -22906,9 +23063,9 @@
         </w:pict>
       </w:r>
     </w:p>
-    <w:bookmarkEnd w:id="90"/>
     <w:bookmarkEnd w:id="91"/>
-    <w:bookmarkStart w:id="94" w:name="trainer"/>
+    <w:bookmarkEnd w:id="92"/>
+    <w:bookmarkStart w:id="95" w:name="trainer"/>
     <w:p>
       <w:pPr>
         <w:pStyle w:val="Heading2"/>
@@ -22957,7 +23114,7 @@
         <w:t xml:space="preserve">answers.</w:t>
       </w:r>
     </w:p>
-    <w:bookmarkStart w:id="92" w:name="loading-a-passage"/>
+    <w:bookmarkStart w:id="93" w:name="loading-a-passage"/>
     <w:p>
       <w:pPr>
         <w:pStyle w:val="Heading3"/>
@@ -23168,8 +23325,8 @@
         <w:t xml:space="preserve">transliteration, at any time, with all layers intact.</w:t>
       </w:r>
     </w:p>
-    <w:bookmarkEnd w:id="92"/>
-    <w:bookmarkStart w:id="93" w:name="the-six-reveal-layers"/>
+    <w:bookmarkEnd w:id="93"/>
+    <w:bookmarkStart w:id="94" w:name="the-six-reveal-layers"/>
     <w:p>
       <w:pPr>
         <w:pStyle w:val="Heading3"/>
@@ -23741,9 +23898,9 @@
         </w:pict>
       </w:r>
     </w:p>
-    <w:bookmarkEnd w:id="93"/>
     <w:bookmarkEnd w:id="94"/>
-    <w:bookmarkStart w:id="97" w:name="drills"/>
+    <w:bookmarkEnd w:id="95"/>
+    <w:bookmarkStart w:id="98" w:name="drills"/>
     <w:p>
       <w:pPr>
         <w:pStyle w:val="Heading2"/>
@@ -23840,7 +23997,7 @@
         <w:t xml:space="preserve">Geshe Michael’s own text. Engine guidance is labeled guidance.</w:t>
       </w:r>
     </w:p>
-    <w:bookmarkStart w:id="95" w:name="the-controls"/>
+    <w:bookmarkStart w:id="96" w:name="the-controls"/>
     <w:p>
       <w:pPr>
         <w:pStyle w:val="Heading3"/>
@@ -24090,8 +24247,8 @@
         <w:t xml:space="preserve">and words you miss most.</w:t>
       </w:r>
     </w:p>
-    <w:bookmarkEnd w:id="95"/>
-    <w:bookmarkStart w:id="96" w:name="the-six-drill-types-one-by-one"/>
+    <w:bookmarkEnd w:id="96"/>
+    <w:bookmarkStart w:id="97" w:name="the-six-drill-types-one-by-one"/>
     <w:p>
       <w:pPr>
         <w:pStyle w:val="Heading3"/>
@@ -24623,10 +24780,10 @@
         <w:t xml:space="preserve">course and line.</w:t>
       </w:r>
     </w:p>
-    <w:bookmarkEnd w:id="96"/>
     <w:bookmarkEnd w:id="97"/>
     <w:bookmarkEnd w:id="98"/>
-    <w:bookmarkStart w:id="99" w:name="Xb1c61f2f22faa6d75e24a930d8bcbaa39aa5802"/>
+    <w:bookmarkEnd w:id="99"/>
+    <w:bookmarkStart w:id="100" w:name="Xb1c61f2f22faa6d75e24a930d8bcbaa39aa5802"/>
     <w:p>
       <w:pPr>
         <w:pStyle w:val="Heading1"/>
@@ -24847,8 +25004,8 @@
         </w:pict>
       </w:r>
     </w:p>
-    <w:bookmarkEnd w:id="99"/>
-    <w:bookmarkStart w:id="108" w:name="chapter-12-the-input-pane-input-input"/>
+    <w:bookmarkEnd w:id="100"/>
+    <w:bookmarkStart w:id="109" w:name="chapter-12-the-input-pane-input-input"/>
     <w:p>
       <w:pPr>
         <w:pStyle w:val="Heading1"/>
@@ -25024,7 +25181,7 @@
         <w:t xml:space="preserve">just did.</w:t>
       </w:r>
     </w:p>
-    <w:bookmarkStart w:id="100" w:name="the-toolbar-control-by-control"/>
+    <w:bookmarkStart w:id="101" w:name="the-toolbar-control-by-control"/>
     <w:p>
       <w:pPr>
         <w:pStyle w:val="Heading2"/>
@@ -25916,8 +26073,8 @@
         <w:t xml:space="preserve">models component — every standard team build has it.)</w:t>
       </w:r>
     </w:p>
-    <w:bookmarkEnd w:id="100"/>
-    <w:bookmarkStart w:id="101" w:name="tutorial-your-first-page"/>
+    <w:bookmarkEnd w:id="101"/>
+    <w:bookmarkStart w:id="102" w:name="tutorial-your-first-page"/>
     <w:p>
       <w:pPr>
         <w:pStyle w:val="Heading2"/>
@@ -26279,8 +26436,8 @@
         <w:t xml:space="preserve">checker handles full texts.)</w:t>
       </w:r>
     </w:p>
-    <w:bookmarkEnd w:id="101"/>
-    <w:bookmarkStart w:id="102" w:name="X9c7f26b0d28d10cf9c0e20ebfe8eb255c0db295"/>
+    <w:bookmarkEnd w:id="102"/>
+    <w:bookmarkStart w:id="103" w:name="X9c7f26b0d28d10cf9c0e20ebfe8eb255c0db295"/>
     <w:p>
       <w:pPr>
         <w:pStyle w:val="Heading2"/>
@@ -26633,8 +26790,8 @@
         <w:t xml:space="preserve">is exported.</w:t>
       </w:r>
     </w:p>
-    <w:bookmarkEnd w:id="102"/>
-    <w:bookmarkStart w:id="103" w:name="scan-follows-typing-in-detail"/>
+    <w:bookmarkEnd w:id="103"/>
+    <w:bookmarkStart w:id="104" w:name="scan-follows-typing-in-detail"/>
     <w:p>
       <w:pPr>
         <w:pStyle w:val="Heading2"/>
@@ -26788,8 +26945,8 @@
         <w:t xml:space="preserve">13, §13.2 tells you where the models go.</w:t>
       </w:r>
     </w:p>
-    <w:bookmarkEnd w:id="103"/>
-    <w:bookmarkStart w:id="104" w:name="the-next-folio-button"/>
+    <w:bookmarkEnd w:id="104"/>
+    <w:bookmarkStart w:id="105" w:name="the-next-folio-button"/>
     <w:p>
       <w:pPr>
         <w:pStyle w:val="Heading2"/>
@@ -27108,8 +27265,8 @@
         <w:t xml:space="preserve">waits on the next line, ready for side 5A’s first line of text.</w:t>
       </w:r>
     </w:p>
-    <w:bookmarkEnd w:id="104"/>
-    <w:bookmarkStart w:id="105" w:name="X1de8c505b8c2bfdf7d7a40bb868ed5ca0918f39"/>
+    <w:bookmarkEnd w:id="105"/>
+    <w:bookmarkStart w:id="106" w:name="X1de8c505b8c2bfdf7d7a40bb868ed5ca0918f39"/>
     <w:p>
       <w:pPr>
         <w:pStyle w:val="Heading2"/>
@@ -27496,8 +27653,8 @@
         <w:t xml:space="preserve">points you to the Scan pane’s download instructions.</w:t>
       </w:r>
     </w:p>
-    <w:bookmarkEnd w:id="105"/>
-    <w:bookmarkStart w:id="106" w:name="Xf797da2f6ff88a43b427ccebf1a76b3f3a819a4"/>
+    <w:bookmarkEnd w:id="106"/>
+    <w:bookmarkStart w:id="107" w:name="Xf797da2f6ff88a43b427ccebf1a76b3f3a819a4"/>
     <w:p>
       <w:pPr>
         <w:pStyle w:val="Heading2"/>
@@ -28030,8 +28187,8 @@
         <w:t xml:space="preserve">you to split it first, and says so in the status line.</w:t>
       </w:r>
     </w:p>
-    <w:bookmarkEnd w:id="106"/>
-    <w:bookmarkStart w:id="107" w:name="save-exporting-the-work"/>
+    <w:bookmarkEnd w:id="107"/>
+    <w:bookmarkStart w:id="108" w:name="save-exporting-the-work"/>
     <w:p>
       <w:pPr>
         <w:pStyle w:val="Heading2"/>
@@ -28250,9 +28407,9 @@
         </w:pict>
       </w:r>
     </w:p>
-    <w:bookmarkEnd w:id="107"/>
     <w:bookmarkEnd w:id="108"/>
-    <w:bookmarkStart w:id="116" w:name="chapter-13-the-ocr-pane-input-ocr"/>
+    <w:bookmarkEnd w:id="109"/>
+    <w:bookmarkStart w:id="117" w:name="chapter-13-the-ocr-pane-input-ocr"/>
     <w:p>
       <w:pPr>
         <w:pStyle w:val="Heading1"/>
@@ -28453,7 +28610,7 @@
         <w:t xml:space="preserve">underneath, where the recognized lines render.</w:t>
       </w:r>
     </w:p>
-    <w:bookmarkStart w:id="109" w:name="the-toolbar-control-by-control-1"/>
+    <w:bookmarkStart w:id="110" w:name="the-toolbar-control-by-control-1"/>
     <w:p>
       <w:pPr>
         <w:pStyle w:val="Heading2"/>
@@ -28753,8 +28910,8 @@
         <w:t xml:space="preserve">scanned volume), one output file per page. See §13.7.</w:t>
       </w:r>
     </w:p>
-    <w:bookmarkEnd w:id="109"/>
-    <w:bookmarkStart w:id="110" w:name="one-time-setup-the-models"/>
+    <w:bookmarkEnd w:id="110"/>
+    <w:bookmarkStart w:id="111" w:name="one-time-setup-the-models"/>
     <w:p>
       <w:pPr>
         <w:pStyle w:val="Heading2"/>
@@ -28857,8 +29014,8 @@
         <w:t xml:space="preserve">place.)</w:t>
       </w:r>
     </w:p>
-    <w:bookmarkEnd w:id="110"/>
-    <w:bookmarkStart w:id="111" w:name="tutorial-recognize-a-page"/>
+    <w:bookmarkEnd w:id="111"/>
+    <w:bookmarkStart w:id="112" w:name="tutorial-recognize-a-page"/>
     <w:p>
       <w:pPr>
         <w:pStyle w:val="Heading2"/>
@@ -29310,8 +29467,8 @@
         <w:t xml:space="preserve">yourself. Click other words to move the highlight around.</w:t>
       </w:r>
     </w:p>
-    <w:bookmarkEnd w:id="111"/>
-    <w:bookmarkStart w:id="112" w:name="X7d749f93979a18d30ddff0b95a97b84dc085818"/>
+    <w:bookmarkEnd w:id="112"/>
+    <w:bookmarkStart w:id="113" w:name="X7d749f93979a18d30ddff0b95a97b84dc085818"/>
     <w:p>
       <w:pPr>
         <w:pStyle w:val="Heading2"/>
@@ -29398,8 +29555,8 @@
         <w:t xml:space="preserve">Untick the box to clear the overlays.</w:t>
       </w:r>
     </w:p>
-    <w:bookmarkEnd w:id="112"/>
-    <w:bookmarkStart w:id="113" w:name="the-illustration-gallery-folder-mode"/>
+    <w:bookmarkEnd w:id="113"/>
+    <w:bookmarkStart w:id="114" w:name="the-illustration-gallery-folder-mode"/>
     <w:p>
       <w:pPr>
         <w:pStyle w:val="Heading2"/>
@@ -29783,8 +29940,8 @@
         <w:t xml:space="preserve">linked volume’s already-cached BDRC pages — see Part One.)</w:t>
       </w:r>
     </w:p>
-    <w:bookmarkEnd w:id="113"/>
-    <w:bookmarkStart w:id="114" w:name="save-to-ocr_out"/>
+    <w:bookmarkEnd w:id="114"/>
+    <w:bookmarkStart w:id="115" w:name="save-to-ocr_out"/>
     <w:p>
       <w:pPr>
         <w:pStyle w:val="Heading2"/>
@@ -29890,8 +30047,8 @@
         <w:t xml:space="preserve">mistake recognition output for verified text.</w:t>
       </w:r>
     </w:p>
-    <w:bookmarkEnd w:id="114"/>
-    <w:bookmarkStart w:id="115" w:name="batch-folder-a-whole-volume"/>
+    <w:bookmarkEnd w:id="115"/>
+    <w:bookmarkStart w:id="116" w:name="batch-folder-a-whole-volume"/>
     <w:p>
       <w:pPr>
         <w:pStyle w:val="Heading2"/>
@@ -30145,9 +30302,9 @@
         </w:pict>
       </w:r>
     </w:p>
-    <w:bookmarkEnd w:id="115"/>
     <w:bookmarkEnd w:id="116"/>
-    <w:bookmarkStart w:id="137" w:name="X3a20423a134726120338426e69aa3db63b45769"/>
+    <w:bookmarkEnd w:id="117"/>
+    <w:bookmarkStart w:id="138" w:name="X3a20423a134726120338426e69aa3db63b45769"/>
     <w:p>
       <w:pPr>
         <w:pStyle w:val="Heading1"/>
@@ -30381,7 +30538,7 @@
         <w:t xml:space="preserve">).</w:t>
       </w:r>
     </w:p>
-    <w:bookmarkStart w:id="117" w:name="choosing-the-folders"/>
+    <w:bookmarkStart w:id="118" w:name="choosing-the-folders"/>
     <w:p>
       <w:pPr>
         <w:pStyle w:val="Heading2"/>
@@ -30470,8 +30627,8 @@
         <w:t xml:space="preserve">the work is where you left it.</w:t>
       </w:r>
     </w:p>
-    <w:bookmarkEnd w:id="117"/>
-    <w:bookmarkStart w:id="118" w:name="reading-the-census-lines"/>
+    <w:bookmarkEnd w:id="118"/>
+    <w:bookmarkStart w:id="119" w:name="reading-the-census-lines"/>
     <w:p>
       <w:pPr>
         <w:pStyle w:val="Heading2"/>
@@ -30616,8 +30773,8 @@
         <w:t xml:space="preserve">cataloger must take from scratch.</w:t>
       </w:r>
     </w:p>
-    <w:bookmarkEnd w:id="118"/>
-    <w:bookmarkStart w:id="119" w:name="X0ec65733cb9a8b14076c5739bc6f729ff2bee49"/>
+    <w:bookmarkEnd w:id="119"/>
+    <w:bookmarkStart w:id="120" w:name="X0ec65733cb9a8b14076c5739bc6f729ff2bee49"/>
     <w:p>
       <w:pPr>
         <w:pStyle w:val="Heading2"/>
@@ -30732,8 +30889,8 @@
         <w:t xml:space="preserve">capped with the cap stated.)</w:t>
       </w:r>
     </w:p>
-    <w:bookmarkEnd w:id="119"/>
-    <w:bookmarkStart w:id="120" w:name="X1295776d5b6a729f02e0b377961eb06cdd0acda"/>
+    <w:bookmarkEnd w:id="120"/>
+    <w:bookmarkStart w:id="121" w:name="X1295776d5b6a729f02e0b377961eb06cdd0acda"/>
     <w:p>
       <w:pPr>
         <w:pStyle w:val="Heading2"/>
@@ -31144,8 +31301,8 @@
         <w:t xml:space="preserve">test run, so they cannot quietly drift.</w:t>
       </w:r>
     </w:p>
-    <w:bookmarkEnd w:id="120"/>
-    <w:bookmarkStart w:id="121" w:name="the-bibliography-audit"/>
+    <w:bookmarkEnd w:id="121"/>
+    <w:bookmarkStart w:id="122" w:name="the-bibliography-audit"/>
     <w:p>
       <w:pPr>
         <w:pStyle w:val="Heading2"/>
@@ -31434,8 +31591,8 @@
         <w:t xml:space="preserve">to whoever is asked to check.</w:t>
       </w:r>
     </w:p>
-    <w:bookmarkEnd w:id="121"/>
-    <w:bookmarkStart w:id="122" w:name="suggested-splits-the-chop-assist"/>
+    <w:bookmarkEnd w:id="122"/>
+    <w:bookmarkStart w:id="123" w:name="suggested-splits-the-chop-assist"/>
     <w:p>
       <w:pPr>
         <w:pStyle w:val="Heading2"/>
@@ -31744,8 +31901,8 @@
         <w:t xml:space="preserve">eye; that is the design, not a shortcoming.</w:t>
       </w:r>
     </w:p>
-    <w:bookmarkEnd w:id="122"/>
-    <w:bookmarkStart w:id="123" w:name="compose-name-the-house-filename-grammar"/>
+    <w:bookmarkEnd w:id="123"/>
+    <w:bookmarkStart w:id="124" w:name="compose-name-the-house-filename-grammar"/>
     <w:p>
       <w:pPr>
         <w:pStyle w:val="Heading2"/>
@@ -32087,8 +32244,8 @@
         <w:t xml:space="preserve">the clipboard for use anywhere else.</w:t>
       </w:r>
     </w:p>
-    <w:bookmarkEnd w:id="123"/>
-    <w:bookmarkStart w:id="124" w:name="Xc3da32da1a61a0fb7f05659e871b74bf55f1927"/>
+    <w:bookmarkEnd w:id="124"/>
+    <w:bookmarkStart w:id="125" w:name="Xc3da32da1a61a0fb7f05659e871b74bf55f1927"/>
     <w:p>
       <w:pPr>
         <w:pStyle w:val="Heading2"/>
@@ -32338,8 +32495,8 @@
         <w:t xml:space="preserve">official catalog — the catalog changes only through data releases.</w:t>
       </w:r>
     </w:p>
-    <w:bookmarkEnd w:id="124"/>
-    <w:bookmarkStart w:id="125" w:name="Xa8ae9900fc8f21a20f51f345a745156279254ad"/>
+    <w:bookmarkEnd w:id="125"/>
+    <w:bookmarkStart w:id="126" w:name="Xa8ae9900fc8f21a20f51f345a745156279254ad"/>
     <w:p>
       <w:pPr>
         <w:pStyle w:val="Heading2"/>
@@ -32574,8 +32731,8 @@
         <w:t xml:space="preserve">and a near whole-title match surfaces for about 62%.</w:t>
       </w:r>
     </w:p>
-    <w:bookmarkEnd w:id="125"/>
-    <w:bookmarkStart w:id="126" w:name="compare-trees-the-divergence-audit"/>
+    <w:bookmarkEnd w:id="126"/>
+    <w:bookmarkStart w:id="127" w:name="compare-trees-the-divergence-audit"/>
     <w:p>
       <w:pPr>
         <w:pStyle w:val="Heading2"/>
@@ -32797,8 +32954,8 @@
         <w:t xml:space="preserve">nothing.</w:t>
       </w:r>
     </w:p>
-    <w:bookmarkEnd w:id="126"/>
-    <w:bookmarkStart w:id="127" w:name="tohoku-numbers-and-colophon-candidates"/>
+    <w:bookmarkEnd w:id="127"/>
+    <w:bookmarkStart w:id="128" w:name="tohoku-numbers-and-colophon-candidates"/>
     <w:p>
       <w:pPr>
         <w:pStyle w:val="Heading2"/>
@@ -33034,8 +33191,8 @@
         <w:t xml:space="preserve">machine locates the evidence; reading it is the cataloger’s work.</w:t>
       </w:r>
     </w:p>
-    <w:bookmarkEnd w:id="127"/>
-    <w:bookmarkStart w:id="128" w:name="provenance-banner-and-the-cleanup-lane"/>
+    <w:bookmarkEnd w:id="128"/>
+    <w:bookmarkStart w:id="129" w:name="provenance-banner-and-the-cleanup-lane"/>
     <w:p>
       <w:pPr>
         <w:pStyle w:val="Heading2"/>
@@ -33300,8 +33457,8 @@
         <w:t xml:space="preserve">western-paginated typed books flagged — the signal works.</w:t>
       </w:r>
     </w:p>
-    <w:bookmarkEnd w:id="128"/>
-    <w:bookmarkStart w:id="129" w:name="load-register-the-three-states"/>
+    <w:bookmarkEnd w:id="129"/>
+    <w:bookmarkStart w:id="130" w:name="load-register-the-three-states"/>
     <w:p>
       <w:pPr>
         <w:pStyle w:val="Heading2"/>
@@ -33517,8 +33674,8 @@
         <w:t xml:space="preserve">plain warning that it does not.</w:t>
       </w:r>
     </w:p>
-    <w:bookmarkEnd w:id="129"/>
-    <w:bookmarkStart w:id="130" w:name="the-change-log-stamp"/>
+    <w:bookmarkEnd w:id="130"/>
+    <w:bookmarkStart w:id="131" w:name="the-change-log-stamp"/>
     <w:p>
       <w:pPr>
         <w:pStyle w:val="Heading2"/>
@@ -33652,8 +33809,8 @@
         <w:t xml:space="preserve">panel.</w:t>
       </w:r>
     </w:p>
-    <w:bookmarkEnd w:id="130"/>
-    <w:bookmarkStart w:id="131" w:name="move-to-shelf-the-handoff"/>
+    <w:bookmarkEnd w:id="131"/>
+    <w:bookmarkStart w:id="132" w:name="move-to-shelf-the-handoff"/>
     <w:p>
       <w:pPr>
         <w:pStyle w:val="Heading2"/>
@@ -33951,8 +34108,8 @@
         <w:t xml:space="preserve">destination count rises, and the work is visibly further along.</w:t>
       </w:r>
     </w:p>
-    <w:bookmarkEnd w:id="131"/>
-    <w:bookmarkStart w:id="132" w:name="the-worksheet"/>
+    <w:bookmarkEnd w:id="132"/>
+    <w:bookmarkStart w:id="133" w:name="the-worksheet"/>
     <w:p>
       <w:pPr>
         <w:pStyle w:val="Heading2"/>
@@ -34262,8 +34419,8 @@
         <w:t xml:space="preserve">spreadsheet — which remains the team’s master.</w:t>
       </w:r>
     </w:p>
-    <w:bookmarkEnd w:id="132"/>
-    <w:bookmarkStart w:id="133" w:name="propose-this-identity-the-routing"/>
+    <w:bookmarkEnd w:id="133"/>
+    <w:bookmarkStart w:id="134" w:name="propose-this-identity-the-routing"/>
     <w:p>
       <w:pPr>
         <w:pStyle w:val="Heading2"/>
@@ -34460,8 +34617,8 @@
         <w:t xml:space="preserve">real answer: there is no machine identity to propose.</w:t>
       </w:r>
     </w:p>
-    <w:bookmarkEnd w:id="133"/>
-    <w:bookmarkStart w:id="134" w:name="qc-intake-the-two-quality-lanes"/>
+    <w:bookmarkEnd w:id="134"/>
+    <w:bookmarkStart w:id="135" w:name="qc-intake-the-two-quality-lanes"/>
     <w:p>
       <w:pPr>
         <w:pStyle w:val="Heading2"/>
@@ -34693,8 +34850,8 @@
         <w:t xml:space="preserve">battery re-measures this on every test run.</w:t>
       </w:r>
     </w:p>
-    <w:bookmarkEnd w:id="134"/>
-    <w:bookmarkStart w:id="135" w:name="X3be440718c2fb96da287412f93f33579e0e8f33"/>
+    <w:bookmarkEnd w:id="135"/>
+    <w:bookmarkStart w:id="136" w:name="X3be440718c2fb96da287412f93f33579e0e8f33"/>
     <w:p>
       <w:pPr>
         <w:pStyle w:val="Heading2"/>
@@ -34953,8 +35110,8 @@
         <w:t xml:space="preserve">human confirms every move.</w:t>
       </w:r>
     </w:p>
-    <w:bookmarkEnd w:id="135"/>
-    <w:bookmarkStart w:id="136" w:name="what-the-workflow-will-do-next"/>
+    <w:bookmarkEnd w:id="136"/>
+    <w:bookmarkStart w:id="137" w:name="what-the-workflow-will-do-next"/>
     <w:p>
       <w:pPr>
         <w:pStyle w:val="Heading2"/>
@@ -35002,9 +35159,9 @@
         </w:pict>
       </w:r>
     </w:p>
-    <w:bookmarkEnd w:id="136"/>
     <w:bookmarkEnd w:id="137"/>
-    <w:bookmarkStart w:id="142" w:name="X9ec64eb07a85eae9b98de9b923277db2a2eae83"/>
+    <w:bookmarkEnd w:id="138"/>
+    <w:bookmarkStart w:id="143" w:name="X9ec64eb07a85eae9b98de9b923277db2a2eae83"/>
     <w:p>
       <w:pPr>
         <w:pStyle w:val="Heading1"/>
@@ -35183,7 +35340,7 @@
         <w:t xml:space="preserve">button with its results area below.</w:t>
       </w:r>
     </w:p>
-    <w:bookmarkStart w:id="138" w:name="one-time-identity-setup"/>
+    <w:bookmarkStart w:id="139" w:name="one-time-identity-setup"/>
     <w:p>
       <w:pPr>
         <w:pStyle w:val="Heading2"/>
@@ -35497,8 +35654,8 @@
         <w:t xml:space="preserve">change them in either place, they are one and the same.</w:t>
       </w:r>
     </w:p>
-    <w:bookmarkEnd w:id="138"/>
-    <w:bookmarkStart w:id="139" w:name="making-a-proposal"/>
+    <w:bookmarkEnd w:id="139"/>
+    <w:bookmarkStart w:id="140" w:name="making-a-proposal"/>
     <w:p>
       <w:pPr>
         <w:pStyle w:val="Heading2"/>
@@ -36185,8 +36342,8 @@
         <w:t xml:space="preserve">— done. It now waits for the ruling.</w:t>
       </w:r>
     </w:p>
-    <w:bookmarkEnd w:id="139"/>
-    <w:bookmarkStart w:id="140" w:name="the-other-ways-proposals-get-filed"/>
+    <w:bookmarkEnd w:id="140"/>
+    <w:bookmarkStart w:id="141" w:name="the-other-ways-proposals-get-filed"/>
     <w:p>
       <w:pPr>
         <w:pStyle w:val="Heading2"/>
@@ -36342,8 +36499,8 @@
         <w:t xml:space="preserve">ruling time — see §15.4.</w:t>
       </w:r>
     </w:p>
-    <w:bookmarkEnd w:id="140"/>
-    <w:bookmarkStart w:id="141" w:name="my-proposals-what-happened"/>
+    <w:bookmarkEnd w:id="141"/>
+    <w:bookmarkStart w:id="142" w:name="my-proposals-what-happened"/>
     <w:p>
       <w:pPr>
         <w:pStyle w:val="Heading2"/>
@@ -36534,9 +36691,9 @@
         </w:pict>
       </w:r>
     </w:p>
-    <w:bookmarkEnd w:id="141"/>
     <w:bookmarkEnd w:id="142"/>
-    <w:bookmarkStart w:id="149" w:name="Xf87a93a906d220c467310f12d976bb46122eb07"/>
+    <w:bookmarkEnd w:id="143"/>
+    <w:bookmarkStart w:id="150" w:name="Xf87a93a906d220c467310f12d976bb46122eb07"/>
     <w:p>
       <w:pPr>
         <w:pStyle w:val="Heading1"/>
@@ -36738,7 +36895,7 @@
         <w:t xml:space="preserve">it the queue itself.</w:t>
       </w:r>
     </w:p>
-    <w:bookmarkStart w:id="143" w:name="reading-the-queue"/>
+    <w:bookmarkStart w:id="144" w:name="reading-the-queue"/>
     <w:p>
       <w:pPr>
         <w:pStyle w:val="Heading2"/>
@@ -36980,8 +37137,8 @@
         <w:t xml:space="preserve">proposals folder in the Propose tab first.”</w:t>
       </w:r>
     </w:p>
-    <w:bookmarkEnd w:id="143"/>
-    <w:bookmarkStart w:id="144" w:name="ruling-on-an-item"/>
+    <w:bookmarkEnd w:id="144"/>
+    <w:bookmarkStart w:id="145" w:name="ruling-on-an-item"/>
     <w:p>
       <w:pPr>
         <w:pStyle w:val="Heading2"/>
@@ -37265,8 +37422,8 @@
         <w:t xml:space="preserve">takes the queue as it stands.</w:t>
       </w:r>
     </w:p>
-    <w:bookmarkEnd w:id="144"/>
-    <w:bookmarkStart w:id="145" w:name="what-each-ruling-actually-does"/>
+    <w:bookmarkEnd w:id="145"/>
+    <w:bookmarkStart w:id="146" w:name="what-each-ruling-actually-does"/>
     <w:p>
       <w:pPr>
         <w:pStyle w:val="Heading2"/>
@@ -37676,8 +37833,8 @@
         <w:t xml:space="preserve">a rejection; it is a positive ruling that teaches the software.</w:t>
       </w:r>
     </w:p>
-    <w:bookmarkEnd w:id="145"/>
-    <w:bookmarkStart w:id="146" w:name="the-kind-filter-one-category-per-sitting"/>
+    <w:bookmarkEnd w:id="146"/>
+    <w:bookmarkStart w:id="147" w:name="the-kind-filter-one-category-per-sitting"/>
     <w:p>
       <w:pPr>
         <w:pStyle w:val="Heading2"/>
@@ -37849,8 +38006,8 @@
         <w:t xml:space="preserve">delivers their proposals to your disk in the background).</w:t>
       </w:r>
     </w:p>
-    <w:bookmarkEnd w:id="146"/>
-    <w:bookmarkStart w:id="147" w:name="export-approved-dictionary-candidates"/>
+    <w:bookmarkEnd w:id="147"/>
+    <w:bookmarkStart w:id="148" w:name="export-approved-dictionary-candidates"/>
     <w:p>
       <w:pPr>
         <w:pStyle w:val="Heading2"/>
@@ -38075,8 +38232,8 @@
         <w:t xml:space="preserve">candidate.</w:t>
       </w:r>
     </w:p>
-    <w:bookmarkEnd w:id="147"/>
-    <w:bookmarkStart w:id="148" w:name="the-rulings-archive"/>
+    <w:bookmarkEnd w:id="148"/>
+    <w:bookmarkStart w:id="149" w:name="the-rulings-archive"/>
     <w:p>
       <w:pPr>
         <w:pStyle w:val="Heading2"/>
@@ -38196,9 +38353,9 @@
         </w:pict>
       </w:r>
     </w:p>
-    <w:bookmarkEnd w:id="148"/>
     <w:bookmarkEnd w:id="149"/>
-    <w:bookmarkStart w:id="160" w:name="chapter-17-the-app-itself"/>
+    <w:bookmarkEnd w:id="150"/>
+    <w:bookmarkStart w:id="161" w:name="chapter-17-the-app-itself"/>
     <w:p>
       <w:pPr>
         <w:pStyle w:val="Heading1"/>
@@ -38221,7 +38378,7 @@
         <w:t xml:space="preserve">a whole rather than to any one pane.</w:t>
       </w:r>
     </w:p>
-    <w:bookmarkStart w:id="150" w:name="the-window-seven-workflow-groups"/>
+    <w:bookmarkStart w:id="151" w:name="the-window-seven-workflow-groups"/>
     <w:p>
       <w:pPr>
         <w:pStyle w:val="Heading2"/>
@@ -38562,8 +38719,8 @@
         <w:t xml:space="preserve">authority role, and carries a live pending count on its tab.)</w:t>
       </w:r>
     </w:p>
-    <w:bookmarkEnd w:id="150"/>
-    <w:bookmarkStart w:id="151" w:name="the-menu-bar-mirrors-the-window"/>
+    <w:bookmarkEnd w:id="151"/>
+    <w:bookmarkStart w:id="152" w:name="the-menu-bar-mirrors-the-window"/>
     <w:p>
       <w:pPr>
         <w:pStyle w:val="Heading2"/>
@@ -38823,8 +38980,8 @@
         <w:t xml:space="preserve">system can literally point at any feature in the app.</w:t>
       </w:r>
     </w:p>
-    <w:bookmarkEnd w:id="151"/>
-    <w:bookmarkStart w:id="152" w:name="X4072019ae30f7b50793bf783af980ededa378c4"/>
+    <w:bookmarkEnd w:id="152"/>
+    <w:bookmarkStart w:id="153" w:name="X4072019ae30f7b50793bf783af980ededa378c4"/>
     <w:p>
       <w:pPr>
         <w:pStyle w:val="Heading2"/>
@@ -39354,8 +39511,8 @@
         <w:t xml:space="preserve">section.</w:t>
       </w:r>
     </w:p>
-    <w:bookmarkEnd w:id="152"/>
-    <w:bookmarkStart w:id="153" w:name="the-settings-dialog-every-field"/>
+    <w:bookmarkEnd w:id="153"/>
+    <w:bookmarkStart w:id="154" w:name="the-settings-dialog-every-field"/>
     <w:p>
       <w:pPr>
         <w:pStyle w:val="Heading2"/>
@@ -39768,8 +39925,8 @@
         <w:t xml:space="preserve">writes them all.</w:t>
       </w:r>
     </w:p>
-    <w:bookmarkEnd w:id="153"/>
-    <w:bookmarkStart w:id="154" w:name="the-help-window"/>
+    <w:bookmarkEnd w:id="154"/>
+    <w:bookmarkStart w:id="155" w:name="the-help-window"/>
     <w:p>
       <w:pPr>
         <w:pStyle w:val="Heading2"/>
@@ -40233,8 +40390,8 @@
         <w:t xml:space="preserve">— you are standing in the Input pane.</w:t>
       </w:r>
     </w:p>
-    <w:bookmarkEnd w:id="154"/>
-    <w:bookmarkStart w:id="155" w:name="night-mode"/>
+    <w:bookmarkEnd w:id="155"/>
+    <w:bookmarkStart w:id="156" w:name="night-mode"/>
     <w:p>
       <w:pPr>
         <w:pStyle w:val="Heading2"/>
@@ -40279,8 +40436,8 @@
         <w:t xml:space="preserve">dark. It applies immediately and is remembered across launches.</w:t>
       </w:r>
     </w:p>
-    <w:bookmarkEnd w:id="155"/>
-    <w:bookmarkStart w:id="156" w:name="X2c349eb4ce50af7037642b129b0429d506e41d5"/>
+    <w:bookmarkEnd w:id="156"/>
+    <w:bookmarkStart w:id="157" w:name="X2c349eb4ce50af7037642b129b0429d506e41d5"/>
     <w:p>
       <w:pPr>
         <w:pStyle w:val="Heading2"/>
@@ -40383,8 +40540,8 @@
         <w:t xml:space="preserve">stays set up.</w:t>
       </w:r>
     </w:p>
-    <w:bookmarkEnd w:id="156"/>
-    <w:bookmarkStart w:id="157" w:name="the-self-test-selftest"/>
+    <w:bookmarkEnd w:id="157"/>
+    <w:bookmarkStart w:id="158" w:name="the-self-test-selftest"/>
     <w:p>
       <w:pPr>
         <w:pStyle w:val="Heading2"/>
@@ -40591,8 +40748,8 @@
         <w:t xml:space="preserve">never compose it.</w:t>
       </w:r>
     </w:p>
-    <w:bookmarkEnd w:id="157"/>
-    <w:bookmarkStart w:id="158" w:name="help-troubleshooting"/>
+    <w:bookmarkEnd w:id="158"/>
+    <w:bookmarkStart w:id="159" w:name="help-troubleshooting"/>
     <w:p>
       <w:pPr>
         <w:pStyle w:val="Heading2"/>
@@ -40833,8 +40990,8 @@
         <w:t xml:space="preserve">confirmation; texts and data untouched; next launch.</w:t>
       </w:r>
     </w:p>
-    <w:bookmarkEnd w:id="158"/>
-    <w:bookmarkStart w:id="159" w:name="hunt-everywhere-k"/>
+    <w:bookmarkEnd w:id="159"/>
+    <w:bookmarkStart w:id="160" w:name="hunt-everywhere-k"/>
     <w:p>
       <w:pPr>
         <w:pStyle w:val="Heading2"/>
@@ -41232,8 +41389,8 @@
         <w:t xml:space="preserve">panes — the palette only saves you the walk.</w:t>
       </w:r>
     </w:p>
-    <w:bookmarkEnd w:id="159"/>
     <w:bookmarkEnd w:id="160"/>
+    <w:bookmarkEnd w:id="161"/>
     <w:sectPr>
       <w:footnotePr>
         <w:numRestart w:val="eachSect"/>

</xml_diff>

<commit_message>
OCR: Run OCR is now asynchronous with a real Stop
Master-board item 6's remainder: recognition runs on a worker thread
(the worker owns page lines, word spans and wylie until one queued
finish call - no cross-thread mutation), progress posts per line, the
button becomes Stop while running, and stopping keeps the recognized
lines clearly labeled as partial. The pane destructor joins the
worker so quit never races a posting thread. All 57 suites green.

Co-Authored-By: Claude Fable 5 <noreply@anthropic.com>
</commit_message>
<xml_diff>
--- a/docs/distribution/USER_MANUAL.docx
+++ b/docs/distribution/USER_MANUAL.docx
@@ -28751,7 +28751,35 @@
         <w:t xml:space="preserve"> </w:t>
       </w:r>
       <w:r>
-        <w:t xml:space="preserve">pipeline on the page. See §13.3.</w:t>
+        <w:t xml:space="preserve">pipeline on the page. Since 2026-08-20 recognition runs in the</w:t>
+      </w:r>
+      <w:r>
+        <w:t xml:space="preserve"> </w:t>
+      </w:r>
+      <w:r>
+        <w:t xml:space="preserve">background: the interface stays live, the button becomes</w:t>
+      </w:r>
+      <w:r>
+        <w:t xml:space="preserve"> </w:t>
+      </w:r>
+      <w:r>
+        <w:rPr>
+          <w:b/>
+          <w:bCs/>
+        </w:rPr>
+        <w:t xml:space="preserve">Stop</w:t>
+      </w:r>
+      <w:r>
+        <w:t xml:space="preserve"> </w:t>
+      </w:r>
+      <w:r>
+        <w:t xml:space="preserve">while it works, and stopping keeps the lines already recognized,</w:t>
+      </w:r>
+      <w:r>
+        <w:t xml:space="preserve"> </w:t>
+      </w:r>
+      <w:r>
+        <w:t xml:space="preserve">clearly labeled as partial. See §13.3.</w:t>
       </w:r>
     </w:p>
     <w:p>

</xml_diff>

<commit_message>
Apparatus anchors route 1: course-constrained passage evidence - 444/2,234 notes anchored
The source-work->course mapping the 08-15 measurement asked for turns
out to already exist: SVN/SSL/OSE carry the three published books
whole. Where a footnote's lemma appears verbatim in the published
English of its OWN course, the aligned passages attach as labeled
PASSAGE candidates - explicitly the passage, never a term equivalence
- which keeps both 08-15 warnings satisfied (the course constraint
kills wrong-work matches; the label keeps the whole segment from
posing as an anchor). +189 notes over routes 3+4; generator banked.
Passage render + floor-420 pins; the raw-wylie sample check now picks
a term anchor. Pecha board entry reconciled (v4 was stale-open;
remaining halves are print- and OCR-stats-gated). All 57 suites green.

Co-Authored-By: Claude Fable 5 <noreply@anthropic.com>
</commit_message>
<xml_diff>
--- a/docs/distribution/USER_MANUAL.docx
+++ b/docs/distribution/USER_MANUAL.docx
@@ -14708,19 +14708,99 @@
         <w:t xml:space="preserve"> </w:t>
       </w:r>
       <w:r>
-        <w:t xml:space="preserve">tier, and marks PROVISIONAL tiers plainly). 252 of the 2,234</w:t>
-      </w:r>
-      <w:r>
-        <w:t xml:space="preserve"> </w:t>
-      </w:r>
-      <w:r>
-        <w:t xml:space="preserve">notes carry such candidates today; the rest stay honestly bare</w:t>
-      </w:r>
-      <w:r>
-        <w:t xml:space="preserve"> </w:t>
-      </w:r>
-      <w:r>
-        <w:t xml:space="preserve">rather than guessed at.</w:t>
+        <w:t xml:space="preserve">tier, and marks PROVISIONAL tiers plainly). A third route (also</w:t>
+      </w:r>
+      <w:r>
+        <w:t xml:space="preserve"> </w:t>
+      </w:r>
+      <w:r>
+        <w:t xml:space="preserve">2026-08-20) adds</w:t>
+      </w:r>
+      <w:r>
+        <w:t xml:space="preserve"> </w:t>
+      </w:r>
+      <w:r>
+        <w:rPr>
+          <w:b/>
+          <w:bCs/>
+        </w:rPr>
+        <w:t xml:space="preserve">passage evidence</w:t>
+      </w:r>
+      <w:r>
+        <w:t xml:space="preserve"> </w:t>
+      </w:r>
+      <w:r>
+        <w:t xml:space="preserve">for notes from the three</w:t>
+      </w:r>
+      <w:r>
+        <w:t xml:space="preserve"> </w:t>
+      </w:r>
+      <w:r>
+        <w:t xml:space="preserve">published single-book sources: where the lemma appears verbatim in</w:t>
+      </w:r>
+      <w:r>
+        <w:t xml:space="preserve"> </w:t>
+      </w:r>
+      <w:r>
+        <w:t xml:space="preserve">the published English of the note’s</w:t>
+      </w:r>
+      <w:r>
+        <w:t xml:space="preserve"> </w:t>
+      </w:r>
+      <w:r>
+        <w:rPr>
+          <w:i/>
+          <w:iCs/>
+        </w:rPr>
+        <w:t xml:space="preserve">own work</w:t>
+      </w:r>
+      <w:r>
+        <w:t xml:space="preserve"> </w:t>
+      </w:r>
+      <w:r>
+        <w:t xml:space="preserve">(the aligned corpus</w:t>
+      </w:r>
+      <w:r>
+        <w:t xml:space="preserve"> </w:t>
+      </w:r>
+      <w:r>
+        <w:t xml:space="preserve">carries each book under one course), the matching passages appear</w:t>
+      </w:r>
+      <w:r>
+        <w:t xml:space="preserve"> </w:t>
+      </w:r>
+      <w:r>
+        <w:t xml:space="preserve">under</w:t>
+      </w:r>
+      <w:r>
+        <w:t xml:space="preserve"> </w:t>
+      </w:r>
+      <w:r>
+        <w:t xml:space="preserve">“WHERE HIS PUBLISHED ENGLISH USES THIS LEMMA”</w:t>
+      </w:r>
+      <w:r>
+        <w:t xml:space="preserve"> </w:t>
+      </w:r>
+      <w:r>
+        <w:t xml:space="preserve">— explicitly</w:t>
+      </w:r>
+      <w:r>
+        <w:t xml:space="preserve"> </w:t>
+      </w:r>
+      <w:r>
+        <w:t xml:space="preserve">the passage, never a term equivalence; you read the Tibetan</w:t>
+      </w:r>
+      <w:r>
+        <w:t xml:space="preserve"> </w:t>
+      </w:r>
+      <w:r>
+        <w:t xml:space="preserve">yourself. 444 of the 2,234 notes carry candidates today; the rest</w:t>
+      </w:r>
+      <w:r>
+        <w:t xml:space="preserve"> </w:t>
+      </w:r>
+      <w:r>
+        <w:t xml:space="preserve">stay honestly bare rather than guessed at.</w:t>
       </w:r>
     </w:p>
     <w:bookmarkEnd w:id="61"/>

</xml_diff>

<commit_message>
English on the carving: hover a woodblock word for its OCR-read wylie + HGM gloss
Idea-bank item shipped: once locate-word has run on a side, hovering
any word on the folio image shows the decoded wylie and Geshe
Michael's English for it, always labeled OCR-read review material.
Cache-only - a mouse move never starts an OCR run. Seeded-cache
selftest pin proves the line-band -> word-span -> gloss mapping and
the label without models or scans. All 57 suites green.

Co-Authored-By: Claude Fable 5 <noreply@anthropic.com>
</commit_message>
<xml_diff>
--- a/docs/distribution/USER_MANUAL.docx
+++ b/docs/distribution/USER_MANUAL.docx
@@ -7470,6 +7470,76 @@
       </w:r>
       <w:r>
         <w:t xml:space="preserve">boxed on the carving.</w:t>
+      </w:r>
+    </w:p>
+    <w:p>
+      <w:pPr>
+        <w:pStyle w:val="BodyText"/>
+      </w:pPr>
+      <w:r>
+        <w:rPr>
+          <w:b/>
+          <w:bCs/>
+        </w:rPr>
+        <w:t xml:space="preserve">English on the carving (hover).</w:t>
+      </w:r>
+      <w:r>
+        <w:t xml:space="preserve"> </w:t>
+      </w:r>
+      <w:r>
+        <w:t xml:space="preserve">Once locate-word has run on a</w:t>
+      </w:r>
+      <w:r>
+        <w:t xml:space="preserve"> </w:t>
+      </w:r>
+      <w:r>
+        <w:t xml:space="preserve">side, hovering any word</w:t>
+      </w:r>
+      <w:r>
+        <w:t xml:space="preserve"> </w:t>
+      </w:r>
+      <w:r>
+        <w:rPr>
+          <w:i/>
+          <w:iCs/>
+        </w:rPr>
+        <w:t xml:space="preserve">on the woodblock image</w:t>
+      </w:r>
+      <w:r>
+        <w:t xml:space="preserve"> </w:t>
+      </w:r>
+      <w:r>
+        <w:t xml:space="preserve">shows a small tip:</w:t>
+      </w:r>
+      <w:r>
+        <w:t xml:space="preserve"> </w:t>
+      </w:r>
+      <w:r>
+        <w:t xml:space="preserve">the OCR-read wylie and Geshe Michael’s English for that word (when</w:t>
+      </w:r>
+      <w:r>
+        <w:t xml:space="preserve"> </w:t>
+      </w:r>
+      <w:r>
+        <w:t xml:space="preserve">the dictionary carries it). The tip always says what it is —</w:t>
+      </w:r>
+      <w:r>
+        <w:t xml:space="preserve"> </w:t>
+      </w:r>
+      <w:r>
+        <w:t xml:space="preserve">OCR-read from the carving, review material, never text. Hovering</w:t>
+      </w:r>
+      <w:r>
+        <w:t xml:space="preserve"> </w:t>
+      </w:r>
+      <w:r>
+        <w:t xml:space="preserve">never starts an OCR run by itself; the boxes come from the</w:t>
+      </w:r>
+      <w:r>
+        <w:t xml:space="preserve"> </w:t>
+      </w:r>
+      <w:r>
+        <w:t xml:space="preserve">locate-word pass you already ran.</w:t>
       </w:r>
     </w:p>
     <w:bookmarkEnd w:id="20"/>

</xml_diff>

<commit_message>
Text DNA strips: a text's whole structure in one clickable picture
Idea-bank item shipped: Overlay REVIEW gains "Text DNA (structure
strip)" - each source line is one colored column (gold on the
dominant meter, vermilion off it, grey prose, pale blank, green
quote-announcement ticks), with hover detail and click-to-jump.
allcore textdna classifies SOURCE lines (the verse analyzer
renumbers by shad segments - the wrong axis for a strip you click);
suite 58 pins the classes and the quote shape; a selftest pin proves
the summary and the jump. All 58 suites green.

Co-Authored-By: Claude Fable 5 <noreply@anthropic.com>
</commit_message>
<xml_diff>
--- a/docs/distribution/USER_MANUAL.docx
+++ b/docs/distribution/USER_MANUAL.docx
@@ -4994,6 +4994,85 @@
       </w:r>
       <w:r>
         <w:t xml:space="preserve">flagged line to jump there.</w:t>
+      </w:r>
+    </w:p>
+    <w:p>
+      <w:pPr>
+        <w:pStyle w:val="BodyText"/>
+      </w:pPr>
+      <w:r>
+        <w:rPr>
+          <w:b/>
+          <w:bCs/>
+        </w:rPr>
+        <w:t xml:space="preserve">Text DNA (structure strip)…</w:t>
+      </w:r>
+      <w:r>
+        <w:t xml:space="preserve"> </w:t>
+      </w:r>
+      <w:r>
+        <w:t xml:space="preserve">— the whole text’s shape in one</w:t>
+      </w:r>
+      <w:r>
+        <w:t xml:space="preserve"> </w:t>
+      </w:r>
+      <w:r>
+        <w:t xml:space="preserve">picture: each source line is one colored column — gold on the</w:t>
+      </w:r>
+      <w:r>
+        <w:t xml:space="preserve"> </w:t>
+      </w:r>
+      <w:r>
+        <w:t xml:space="preserve">dominant meter, vermilion for a verse line off the meter, grey for</w:t>
+      </w:r>
+      <w:r>
+        <w:t xml:space="preserve"> </w:t>
+      </w:r>
+      <w:r>
+        <w:t xml:space="preserve">prose, pale for blank, with a green tick over lines carrying a</w:t>
+      </w:r>
+      <w:r>
+        <w:t xml:space="preserve"> </w:t>
+      </w:r>
+      <w:r>
+        <w:t xml:space="preserve">quote announcement (…</w:t>
+      </w:r>
+      <w:r>
+        <w:rPr>
+          <w:i/>
+          <w:iCs/>
+        </w:rPr>
+        <w:t xml:space="preserve">zhes/ces</w:t>
+      </w:r>
+      <w:r>
+        <w:t xml:space="preserve"> </w:t>
+      </w:r>
+      <w:r>
+        <w:t xml:space="preserve">+ a speech verb). The summary line</w:t>
+      </w:r>
+      <w:r>
+        <w:t xml:space="preserve"> </w:t>
+      </w:r>
+      <w:r>
+        <w:t xml:space="preserve">gives the counts; hover for any line’s number and syllables; click</w:t>
+      </w:r>
+      <w:r>
+        <w:t xml:space="preserve"> </w:t>
+      </w:r>
+      <w:r>
+        <w:t xml:space="preserve">anywhere and the document jumps there. Pure measurement — the</w:t>
+      </w:r>
+      <w:r>
+        <w:t xml:space="preserve"> </w:t>
+      </w:r>
+      <w:r>
+        <w:t xml:space="preserve">strip shows only what the syllable arithmetic and the quote</w:t>
+      </w:r>
+      <w:r>
+        <w:t xml:space="preserve"> </w:t>
+      </w:r>
+      <w:r>
+        <w:t xml:space="preserve">grammar actually found.</w:t>
       </w:r>
     </w:p>
     <w:p>

</xml_diff>

<commit_message>
Manual: the 9n wave documented (folio strip, house styles, Edit menu, Hunt button, Quick Access, ribbon panes)
Co-Authored-By: Claude Fable 5 <noreply@anthropic.com>
</commit_message>
<xml_diff>
--- a/docs/distribution/USER_MANUAL.docx
+++ b/docs/distribution/USER_MANUAL.docx
@@ -12046,6 +12046,64 @@
     </w:p>
     <w:p>
       <w:pPr>
+        <w:pStyle w:val="BlockText"/>
+      </w:pPr>
+      <w:r>
+        <w:rPr>
+          <w:b/>
+          <w:bCs/>
+        </w:rPr>
+        <w:t xml:space="preserve">House styles (2026-08-20).</w:t>
+      </w:r>
+      <w:r>
+        <w:t xml:space="preserve"> </w:t>
+      </w:r>
+      <w:r>
+        <w:t xml:space="preserve">The Manuscript bar is now a ribbon</w:t>
+      </w:r>
+      <w:r>
+        <w:t xml:space="preserve"> </w:t>
+      </w:r>
+      <w:r>
+        <w:t xml:space="preserve">with a</w:t>
+      </w:r>
+      <w:r>
+        <w:t xml:space="preserve"> </w:t>
+      </w:r>
+      <w:r>
+        <w:rPr>
+          <w:b/>
+          <w:bCs/>
+        </w:rPr>
+        <w:t xml:space="preserve">HOUSE STYLES</w:t>
+      </w:r>
+      <w:r>
+        <w:t xml:space="preserve"> </w:t>
+      </w:r>
+      <w:r>
+        <w:t xml:space="preserve">gallery — Body, Heading, Section, Verse,</w:t>
+      </w:r>
+      <w:r>
+        <w:t xml:space="preserve"> </w:t>
+      </w:r>
+      <w:r>
+        <w:t xml:space="preserve">Colophon — each button previewing its own look. Select paragraphs</w:t>
+      </w:r>
+      <w:r>
+        <w:t xml:space="preserve"> </w:t>
+      </w:r>
+      <w:r>
+        <w:t xml:space="preserve">and click: the style applies (indent, weight, size, italics per</w:t>
+      </w:r>
+      <w:r>
+        <w:t xml:space="preserve"> </w:t>
+      </w:r>
+      <w:r>
+        <w:t xml:space="preserve">the published books’ grammar) and the RTF export carries it.</w:t>
+      </w:r>
+    </w:p>
+    <w:p>
+      <w:pPr>
         <w:pStyle w:val="FirstParagraph"/>
       </w:pPr>
       <w:r>
@@ -26689,6 +26747,48 @@
     </w:p>
     <w:p>
       <w:pPr>
+        <w:pStyle w:val="BlockText"/>
+      </w:pPr>
+      <w:r>
+        <w:rPr>
+          <w:b/>
+          <w:bCs/>
+        </w:rPr>
+        <w:t xml:space="preserve">The folio strip (2026-08-20).</w:t>
+      </w:r>
+      <w:r>
+        <w:t xml:space="preserve"> </w:t>
+      </w:r>
+      <w:r>
+        <w:t xml:space="preserve">In block mode a thumbnail rail</w:t>
+      </w:r>
+      <w:r>
+        <w:t xml:space="preserve"> </w:t>
+      </w:r>
+      <w:r>
+        <w:t xml:space="preserve">runs beneath the editor — every page of the block as a small</w:t>
+      </w:r>
+      <w:r>
+        <w:t xml:space="preserve"> </w:t>
+      </w:r>
+      <w:r>
+        <w:t xml:space="preserve">image, a ✓ on pages that already carry typing, the current page</w:t>
+      </w:r>
+      <w:r>
+        <w:t xml:space="preserve"> </w:t>
+      </w:r>
+      <w:r>
+        <w:t xml:space="preserve">highlighted. Click any thumbnail to jump there. Thumbnails fill</w:t>
+      </w:r>
+      <w:r>
+        <w:t xml:space="preserve"> </w:t>
+      </w:r>
+      <w:r>
+        <w:t xml:space="preserve">in lazily, so a 400-page volume opens instantly.</w:t>
+      </w:r>
+    </w:p>
+    <w:p>
+      <w:pPr>
         <w:pStyle w:val="FirstParagraph"/>
       </w:pPr>
       <w:r>
@@ -39193,6 +39293,130 @@
       </w:pPr>
       <w:r>
         <w:t xml:space="preserve">CHAPTER 17 — THE APP ITSELF</w:t>
+      </w:r>
+    </w:p>
+    <w:p>
+      <w:pPr>
+        <w:pStyle w:val="BlockText"/>
+      </w:pPr>
+      <w:r>
+        <w:rPr>
+          <w:b/>
+          <w:bCs/>
+        </w:rPr>
+        <w:t xml:space="preserve">New in the Word-style wave (2026-08-20):</w:t>
+      </w:r>
+      <w:r>
+        <w:t xml:space="preserve"> </w:t>
+      </w:r>
+      <w:r>
+        <w:t xml:space="preserve">an</w:t>
+      </w:r>
+      <w:r>
+        <w:t xml:space="preserve"> </w:t>
+      </w:r>
+      <w:r>
+        <w:rPr>
+          <w:b/>
+          <w:bCs/>
+        </w:rPr>
+        <w:t xml:space="preserve">Edit menu</w:t>
+      </w:r>
+      <w:r>
+        <w:t xml:space="preserve"> </w:t>
+      </w:r>
+      <w:r>
+        <w:t xml:space="preserve">(Undo/Redo, Cut/Copy/Paste/Delete, Select All) acting on</w:t>
+      </w:r>
+      <w:r>
+        <w:t xml:space="preserve"> </w:t>
+      </w:r>
+      <w:r>
+        <w:t xml:space="preserve">whichever editor has focus; a visible</w:t>
+      </w:r>
+      <w:r>
+        <w:t xml:space="preserve"> </w:t>
+      </w:r>
+      <w:r>
+        <w:rPr>
+          <w:b/>
+          <w:bCs/>
+        </w:rPr>
+        <w:t xml:space="preserve">🔎 Hunt (⌘K)</w:t>
+      </w:r>
+      <w:r>
+        <w:t xml:space="preserve"> </w:t>
+      </w:r>
+      <w:r>
+        <w:t xml:space="preserve">button</w:t>
+      </w:r>
+      <w:r>
+        <w:t xml:space="preserve"> </w:t>
+      </w:r>
+      <w:r>
+        <w:t xml:space="preserve">beside the group tabs; and the</w:t>
+      </w:r>
+      <w:r>
+        <w:t xml:space="preserve"> </w:t>
+      </w:r>
+      <w:r>
+        <w:rPr>
+          <w:b/>
+          <w:bCs/>
+        </w:rPr>
+        <w:t xml:space="preserve">Quick Access Toolbar</w:t>
+      </w:r>
+      <w:r>
+        <w:t xml:space="preserve"> </w:t>
+      </w:r>
+      <w:r>
+        <w:t xml:space="preserve">— the</w:t>
+      </w:r>
+      <w:r>
+        <w:t xml:space="preserve"> </w:t>
+      </w:r>
+      <w:r>
+        <w:t xml:space="preserve">thin strip above the tabs where the ★ menu lets you pin any</w:t>
+      </w:r>
+      <w:r>
+        <w:t xml:space="preserve"> </w:t>
+      </w:r>
+      <w:r>
+        <w:t xml:space="preserve">command from any pane, kept one click away everywhere. The</w:t>
+      </w:r>
+      <w:r>
+        <w:t xml:space="preserve"> </w:t>
+      </w:r>
+      <w:r>
+        <w:t xml:space="preserve">Catalog, OCR, Library, and Manuscript panes now present their</w:t>
+      </w:r>
+      <w:r>
+        <w:t xml:space="preserve"> </w:t>
+      </w:r>
+      <w:r>
+        <w:t xml:space="preserve">tools as a</w:t>
+      </w:r>
+      <w:r>
+        <w:t xml:space="preserve"> </w:t>
+      </w:r>
+      <w:r>
+        <w:rPr>
+          <w:b/>
+          <w:bCs/>
+        </w:rPr>
+        <w:t xml:space="preserve">ribbon</w:t>
+      </w:r>
+      <w:r>
+        <w:t xml:space="preserve"> </w:t>
+      </w:r>
+      <w:r>
+        <w:t xml:space="preserve">— labeled groups in one strip, captions</w:t>
+      </w:r>
+      <w:r>
+        <w:t xml:space="preserve"> </w:t>
+      </w:r>
+      <w:r>
+        <w:t xml:space="preserve">beneath — with more panes following.</w:t>
       </w:r>
     </w:p>
     <w:p>

</xml_diff>